<commit_message>
321d4855a58022a99e6e78ed16d3ce2039b9b650 deploy: siteground artifact
</commit_message>
<xml_diff>
--- a/hub/manuals/core-admin.docx
+++ b/hub/manuals/core-admin.docx
@@ -3087,7 +3087,7 @@
         <w:t xml:space="preserve">Save</w:t>
       </w:r>
       <w:r>
-        <w:t xml:space="preserve">. You see "Saved. The public Ministries page updates when the site next rebuilds."</w:t>
+        <w:t xml:space="preserve">. You see "Saved. The public ministry pages update within a few minutes."</w:t>
       </w:r>
     </w:p>
     <w:p>
@@ -3669,7 +3669,7 @@
         </w:numPr>
       </w:pPr>
       <w:r>
-        <w:t xml:space="preserve">Saved details reach the public Ministries page when the site next rebuilds.</w:t>
+        <w:t xml:space="preserve">Saved details reach the public Ministries page and each ministry's own page within a few minutes.</w:t>
       </w:r>
     </w:p>
     <w:p>
@@ -7609,7 +7609,13 @@
         <w:spacing w:after="120"/>
       </w:pPr>
       <w:r>
-        <w:t xml:space="preserve">Site editors make those changes. If your work needs them, give your own account the </w:t>
+        <w:t xml:space="preserve">Site editors make those changes. The </w:t>
+      </w:r>
+      <w:r>
+        <w:t xml:space="preserve">Site editor manual</w:t>
+      </w:r>
+      <w:r>
+        <w:t xml:space="preserve"> explains what each tab does. If your work needs them, give your own account the </w:t>
       </w:r>
       <w:r>
         <w:rPr>
@@ -8260,7 +8266,7 @@
                 <w:b/>
                 <w:bCs/>
               </w:rPr>
-              <w:t xml:space="preserve">Banner</w:t>
+              <w:t xml:space="preserve">Site banner</w:t>
             </w:r>
             <w:r>
               <w:t xml:space="preserve">. Update minister contact records in Media Hub by hand.</w:t>
@@ -8725,7 +8731,13 @@
         <w:t xml:space="preserve">Files</w:t>
       </w:r>
       <w:r>
-        <w:t xml:space="preserve"> first.</w:t>
+        <w:t xml:space="preserve"> first. See </w:t>
+      </w:r>
+      <w:r>
+        <w:t xml:space="preserve">Organizations</w:t>
+      </w:r>
+      <w:r>
+        <w:t xml:space="preserve">.</w:t>
       </w:r>
     </w:p>
     <w:p>
@@ -8764,10 +8776,16 @@
           <w:b/>
           <w:bCs/>
         </w:rPr>
-        <w:t xml:space="preserve">Banner</w:t>
-      </w:r>
-      <w:r>
-        <w:t xml:space="preserve">, and publish.</w:t>
+        <w:t xml:space="preserve">Site banner</w:t>
+      </w:r>
+      <w:r>
+        <w:t xml:space="preserve">, and publish. See </w:t>
+      </w:r>
+      <w:r>
+        <w:t xml:space="preserve">Site banner</w:t>
+      </w:r>
+      <w:r>
+        <w:t xml:space="preserve">.</w:t>
       </w:r>
     </w:p>
     <w:p>

</xml_diff>

<commit_message>
cc9fbb19840b235f1c998ce292038e5444eb6a38 deploy: siteground artifact
</commit_message>
<xml_diff>
--- a/hub/manuals/core-admin.docx
+++ b/hub/manuals/core-admin.docx
@@ -2429,7 +2429,7 @@
         </w:numPr>
       </w:pPr>
       <w:r>
-        <w:t xml:space="preserve">"Only a System Administrator or a Core admin can change this user's access."</w:t>
+        <w:t xml:space="preserve">"Only a System Administrator or a Core administrator can change this user's access."</w:t>
       </w:r>
     </w:p>
     <w:p>
@@ -2441,7 +2441,7 @@
         </w:numPr>
       </w:pPr>
       <w:r>
-        <w:t xml:space="preserve">"Only an HQ Administrator, a System Administrator or a Core admin can change this user's access."</w:t>
+        <w:t xml:space="preserve">"Only an HQ Administrator, a System Administrator or a Core administrator can change this user's access."</w:t>
       </w:r>
     </w:p>
     <w:p>
@@ -2453,7 +2453,7 @@
         </w:numPr>
       </w:pPr>
       <w:r>
-        <w:t xml:space="preserve">"Only a Core admin can give Calendar access to an inactive user who has none."</w:t>
+        <w:t xml:space="preserve">"Only a Core administrator can give Calendar access to an inactive user who has none."</w:t>
       </w:r>
     </w:p>
     <w:p>
@@ -2551,14 +2551,14 @@
         <w:tc>
           <w:p>
             <w:r>
-              <w:t xml:space="preserve">"unknown or inactive ministry: health"</w:t>
-            </w:r>
-          </w:p>
-        </w:tc>
-        <w:tc>
-          <w:p>
-            <w:r>
-              <w:t xml:space="preserve">The named ministry (shown by its short web name) was deactivated while you were editing. Untick it. A person who already had a deactivated ministry keeps it when you save.</w:t>
+              <w:t xml:space="preserve">"Health is no longer active or doesn't exist. Untick it, then save again."</w:t>
+            </w:r>
+          </w:p>
+        </w:tc>
+        <w:tc>
+          <w:p>
+            <w:r>
+              <w:t xml:space="preserve">The named ministry was deactivated while you were editing. Untick it. A person who already had a deactivated ministry keeps it when you save.</w:t>
             </w:r>
           </w:p>
         </w:tc>

</xml_diff>

<commit_message>
8f386daa023c314d1cf352bddce06bb114086e8c deploy: siteground artifact
</commit_message>
<xml_diff>
--- a/hub/manuals/core-admin.docx
+++ b/hub/manuals/core-admin.docx
@@ -76,7 +76,7 @@
           <w:sz w:val="24"/>
           <w:szCs w:val="24"/>
         </w:rPr>
-        <w:t xml:space="preserve">Software version of October 30, 2026</w:t>
+        <w:t xml:space="preserve">Software version of October 31, 2026</w:t>
       </w:r>
     </w:p>
     <w:p>
@@ -1338,7 +1338,7 @@
         </w:numPr>
       </w:pPr>
       <w:r>
-        <w:t xml:space="preserve">Make one change, then choose the button beside it:</w:t>
+        <w:t xml:space="preserve">Make one change, then choose the button beside it. Each button saves only its own part:</w:t>
       </w:r>
     </w:p>
     <w:p>
@@ -1360,7 +1360,7 @@
         <w:t xml:space="preserve">Save name</w:t>
       </w:r>
       <w:r>
-        <w:t xml:space="preserve">.</w:t>
+        <w:t xml:space="preserve">. Until you do, "Name not saved yet." shows beside it.</w:t>
       </w:r>
     </w:p>
     <w:p>
@@ -1382,7 +1382,7 @@
         <w:t xml:space="preserve">Save roles</w:t>
       </w:r>
       <w:r>
-        <w:t xml:space="preserve">. Saving replaces all their roles with the ticked ones.</w:t>
+        <w:t xml:space="preserve">. Until you do, "Roles not saved yet." shows beside it. Saving replaces all their roles with the ticked ones.</w:t>
       </w:r>
     </w:p>
     <w:p>
@@ -1394,7 +1394,47 @@
         </w:numPr>
       </w:pPr>
       <w:r>
-        <w:t xml:space="preserve">To set a new password, type it and choose </w:t>
+        <w:t xml:space="preserve">Under </w:t>
+      </w:r>
+      <w:r>
+        <w:rPr>
+          <w:b/>
+          <w:bCs/>
+        </w:rPr>
+        <w:t xml:space="preserve">Account</w:t>
+      </w:r>
+      <w:r>
+        <w:t xml:space="preserve">, each action takes effect on its own: </w:t>
+      </w:r>
+      <w:r>
+        <w:rPr>
+          <w:b/>
+          <w:bCs/>
+        </w:rPr>
+        <w:t xml:space="preserve">Active</w:t>
+      </w:r>
+      <w:r>
+        <w:t xml:space="preserve">, </w:t>
+      </w:r>
+      <w:r>
+        <w:rPr>
+          <w:b/>
+          <w:bCs/>
+        </w:rPr>
+        <w:t xml:space="preserve">Unlink Microsoft sign-in</w:t>
+      </w:r>
+      <w:r>
+        <w:t xml:space="preserve">, and </w:t>
+      </w:r>
+      <w:r>
+        <w:rPr>
+          <w:b/>
+          <w:bCs/>
+        </w:rPr>
+        <w:t xml:space="preserve">Set password</w:t>
+      </w:r>
+      <w:r>
+        <w:t xml:space="preserve">. To set a new password, type it and choose </w:t>
       </w:r>
       <w:r>
         <w:rPr>
@@ -2803,10 +2843,20 @@
           <w:b/>
           <w:bCs/>
         </w:rPr>
-        <w:t xml:space="preserve">Sort order</w:t>
-      </w:r>
-      <w:r>
-        <w:t xml:space="preserve">: a whole number that places the ministry in lists.</w:t>
+        <w:t xml:space="preserve">Abbreviation</w:t>
+      </w:r>
+      <w:r>
+        <w:t xml:space="preserve"> and </w:t>
+      </w:r>
+      <w:r>
+        <w:rPr>
+          <w:b/>
+          <w:bCs/>
+        </w:rPr>
+        <w:t xml:space="preserve">Parent ministry</w:t>
+      </w:r>
+      <w:r>
+        <w:t xml:space="preserve">, straight after the names. Only you see these.</w:t>
       </w:r>
     </w:p>
     <w:p>
@@ -2822,60 +2872,10 @@
           <w:b/>
           <w:bCs/>
         </w:rPr>
-        <w:t xml:space="preserve">Minister name</w:t>
-      </w:r>
-      <w:r>
-        <w:t xml:space="preserve"> (with the title, such as "Honourable Jane Doe"), </w:t>
-      </w:r>
-      <w:r>
-        <w:rPr>
-          <w:b/>
-          <w:bCs/>
-        </w:rPr>
-        <w:t xml:space="preserve">Minister summary</w:t>
-      </w:r>
-      <w:r>
-        <w:t xml:space="preserve">, </w:t>
-      </w:r>
-      <w:r>
-        <w:rPr>
-          <w:b/>
-          <w:bCs/>
-        </w:rPr>
-        <w:t xml:space="preserve">Minister email</w:t>
-      </w:r>
-      <w:r>
-        <w:t xml:space="preserve"> and </w:t>
-      </w:r>
-      <w:r>
-        <w:rPr>
-          <w:b/>
-          <w:bCs/>
-        </w:rPr>
-        <w:t xml:space="preserve">Minister photo URL</w:t>
-      </w:r>
-      <w:r>
-        <w:t xml:space="preserve">. Upload the photo under </w:t>
-      </w:r>
-      <w:r>
-        <w:rPr>
-          <w:b/>
-          <w:bCs/>
-        </w:rPr>
-        <w:t xml:space="preserve">Website</w:t>
-      </w:r>
-      <w:r>
-        <w:t xml:space="preserve"> &gt; </w:t>
-      </w:r>
-      <w:r>
-        <w:rPr>
-          <w:b/>
-          <w:bCs/>
-        </w:rPr>
-        <w:t xml:space="preserve">Files</w:t>
-      </w:r>
-      <w:r>
-        <w:t xml:space="preserve"> first, then paste its address. A preview appears once the address starts with https://.</w:t>
+        <w:t xml:space="preserve">Sort order</w:t>
+      </w:r>
+      <w:r>
+        <w:t xml:space="preserve">: a whole number that places the ministry in lists.</w:t>
       </w:r>
     </w:p>
     <w:p>
@@ -2891,20 +2891,60 @@
           <w:b/>
           <w:bCs/>
         </w:rPr>
-        <w:t xml:space="preserve">Minister biography</w:t>
-      </w:r>
-      <w:r>
-        <w:t xml:space="preserve">: shown on the minister's biography page, linked as Read Bio. </w:t>
-      </w:r>
-      <w:r>
-        <w:rPr>
-          <w:b/>
-          <w:bCs/>
-        </w:rPr>
-        <w:t xml:space="preserve">Clear the biography</w:t>
-      </w:r>
-      <w:r>
-        <w:t xml:space="preserve"> removes that page. After you rename the minister, a note warns "The biography still describes the previous minister."</w:t>
+        <w:t xml:space="preserve">Minister name</w:t>
+      </w:r>
+      <w:r>
+        <w:t xml:space="preserve"> (with the title, such as "Honourable Jane Doe"), </w:t>
+      </w:r>
+      <w:r>
+        <w:rPr>
+          <w:b/>
+          <w:bCs/>
+        </w:rPr>
+        <w:t xml:space="preserve">Minister summary</w:t>
+      </w:r>
+      <w:r>
+        <w:t xml:space="preserve">, </w:t>
+      </w:r>
+      <w:r>
+        <w:rPr>
+          <w:b/>
+          <w:bCs/>
+        </w:rPr>
+        <w:t xml:space="preserve">Minister email</w:t>
+      </w:r>
+      <w:r>
+        <w:t xml:space="preserve"> and </w:t>
+      </w:r>
+      <w:r>
+        <w:rPr>
+          <w:b/>
+          <w:bCs/>
+        </w:rPr>
+        <w:t xml:space="preserve">Minister photo URL</w:t>
+      </w:r>
+      <w:r>
+        <w:t xml:space="preserve">. Upload the photo under </w:t>
+      </w:r>
+      <w:r>
+        <w:rPr>
+          <w:b/>
+          <w:bCs/>
+        </w:rPr>
+        <w:t xml:space="preserve">Website</w:t>
+      </w:r>
+      <w:r>
+        <w:t xml:space="preserve"> &gt; </w:t>
+      </w:r>
+      <w:r>
+        <w:rPr>
+          <w:b/>
+          <w:bCs/>
+        </w:rPr>
+        <w:t xml:space="preserve">Files</w:t>
+      </w:r>
+      <w:r>
+        <w:t xml:space="preserve"> first, then paste its address. A preview appears once the address starts with https://.</w:t>
       </w:r>
     </w:p>
     <w:p>
@@ -2920,110 +2960,20 @@
           <w:b/>
           <w:bCs/>
         </w:rPr>
-        <w:t xml:space="preserve">Meet the Team links</w:t>
-      </w:r>
-      <w:r>
-        <w:t xml:space="preserve">, </w:t>
-      </w:r>
-      <w:r>
-        <w:rPr>
-          <w:b/>
-          <w:bCs/>
-        </w:rPr>
-        <w:t xml:space="preserve">Media contacts</w:t>
-      </w:r>
-      <w:r>
-        <w:t xml:space="preserve"> (</w:t>
-      </w:r>
-      <w:r>
-        <w:rPr>
-          <w:b/>
-          <w:bCs/>
-        </w:rPr>
-        <w:t xml:space="preserve">Primary contact</w:t>
-      </w:r>
-      <w:r>
-        <w:t xml:space="preserve">, </w:t>
-      </w:r>
-      <w:r>
-        <w:rPr>
-          <w:b/>
-          <w:bCs/>
-        </w:rPr>
-        <w:t xml:space="preserve">Alternate contact</w:t>
-      </w:r>
-      <w:r>
-        <w:t xml:space="preserve">, </w:t>
-      </w:r>
-      <w:r>
-        <w:rPr>
-          <w:b/>
-          <w:bCs/>
-        </w:rPr>
-        <w:t xml:space="preserve">After-hours phone</w:t>
-      </w:r>
-      <w:r>
-        <w:t xml:space="preserve">) and </w:t>
-      </w:r>
-      <w:r>
-        <w:rPr>
-          <w:b/>
-          <w:bCs/>
-        </w:rPr>
-        <w:t xml:space="preserve">Ministry page links</w:t>
-      </w:r>
-      <w:r>
-        <w:t xml:space="preserve"> (</w:t>
-      </w:r>
-      <w:r>
-        <w:rPr>
-          <w:b/>
-          <w:bCs/>
-        </w:rPr>
-        <w:t xml:space="preserve">Ministry website</w:t>
-      </w:r>
-      <w:r>
-        <w:t xml:space="preserve">, </w:t>
-      </w:r>
-      <w:r>
-        <w:rPr>
-          <w:b/>
-          <w:bCs/>
-        </w:rPr>
-        <w:t xml:space="preserve">Photos (Flickr) address</w:t>
-      </w:r>
-      <w:r>
-        <w:t xml:space="preserve">, </w:t>
-      </w:r>
-      <w:r>
-        <w:rPr>
-          <w:b/>
-          <w:bCs/>
-        </w:rPr>
-        <w:t xml:space="preserve">Videos (YouTube) address</w:t>
-      </w:r>
-      <w:r>
-        <w:t xml:space="preserve">, </w:t>
-      </w:r>
-      <w:r>
-        <w:rPr>
-          <w:b/>
-          <w:bCs/>
-        </w:rPr>
-        <w:t xml:space="preserve">Featured Topics</w:t>
-      </w:r>
-      <w:r>
-        <w:t xml:space="preserve">, </w:t>
-      </w:r>
-      <w:r>
-        <w:rPr>
-          <w:b/>
-          <w:bCs/>
-        </w:rPr>
-        <w:t xml:space="preserve">Featured Services</w:t>
-      </w:r>
-      <w:r>
-        <w:t xml:space="preserve">).</w:t>
+        <w:t xml:space="preserve">Minister biography</w:t>
+      </w:r>
+      <w:r>
+        <w:t xml:space="preserve">: shown on the minister's biography page, linked as Read Bio. </w:t>
+      </w:r>
+      <w:r>
+        <w:rPr>
+          <w:b/>
+          <w:bCs/>
+        </w:rPr>
+        <w:t xml:space="preserve">Clear the biography</w:t>
+      </w:r>
+      <w:r>
+        <w:t xml:space="preserve"> removes that page. After you rename the minister, a note warns "The biography still describes the previous minister."</w:t>
       </w:r>
     </w:p>
     <w:p>
@@ -3035,14 +2985,11 @@
         </w:numPr>
       </w:pPr>
       <w:r>
-        <w:t xml:space="preserve">Only you see the last three fields: </w:t>
-      </w:r>
-      <w:r>
-        <w:rPr>
-          <w:b/>
-          <w:bCs/>
-        </w:rPr>
-        <w:t xml:space="preserve">Abbreviation</w:t>
+        <w:rPr>
+          <w:b/>
+          <w:bCs/>
+        </w:rPr>
+        <w:t xml:space="preserve">Meet the Team links</w:t>
       </w:r>
       <w:r>
         <w:t xml:space="preserve">, </w:t>
@@ -3052,11 +2999,110 @@
           <w:b/>
           <w:bCs/>
         </w:rPr>
-        <w:t xml:space="preserve">Parent ministry</w:t>
-      </w:r>
-      <w:r>
-        <w:t xml:space="preserve"> and </w:t>
-      </w:r>
+        <w:t xml:space="preserve">Media contacts</w:t>
+      </w:r>
+      <w:r>
+        <w:t xml:space="preserve"> (</w:t>
+      </w:r>
+      <w:r>
+        <w:rPr>
+          <w:b/>
+          <w:bCs/>
+        </w:rPr>
+        <w:t xml:space="preserve">Primary contact</w:t>
+      </w:r>
+      <w:r>
+        <w:t xml:space="preserve">, </w:t>
+      </w:r>
+      <w:r>
+        <w:rPr>
+          <w:b/>
+          <w:bCs/>
+        </w:rPr>
+        <w:t xml:space="preserve">Alternate contact</w:t>
+      </w:r>
+      <w:r>
+        <w:t xml:space="preserve">, </w:t>
+      </w:r>
+      <w:r>
+        <w:rPr>
+          <w:b/>
+          <w:bCs/>
+        </w:rPr>
+        <w:t xml:space="preserve">After-hours phone</w:t>
+      </w:r>
+      <w:r>
+        <w:t xml:space="preserve">) and </w:t>
+      </w:r>
+      <w:r>
+        <w:rPr>
+          <w:b/>
+          <w:bCs/>
+        </w:rPr>
+        <w:t xml:space="preserve">Ministry page links</w:t>
+      </w:r>
+      <w:r>
+        <w:t xml:space="preserve"> (</w:t>
+      </w:r>
+      <w:r>
+        <w:rPr>
+          <w:b/>
+          <w:bCs/>
+        </w:rPr>
+        <w:t xml:space="preserve">Ministry website</w:t>
+      </w:r>
+      <w:r>
+        <w:t xml:space="preserve">, </w:t>
+      </w:r>
+      <w:r>
+        <w:rPr>
+          <w:b/>
+          <w:bCs/>
+        </w:rPr>
+        <w:t xml:space="preserve">Photos (Flickr) address</w:t>
+      </w:r>
+      <w:r>
+        <w:t xml:space="preserve">, </w:t>
+      </w:r>
+      <w:r>
+        <w:rPr>
+          <w:b/>
+          <w:bCs/>
+        </w:rPr>
+        <w:t xml:space="preserve">Videos (YouTube) address</w:t>
+      </w:r>
+      <w:r>
+        <w:t xml:space="preserve">, </w:t>
+      </w:r>
+      <w:r>
+        <w:rPr>
+          <w:b/>
+          <w:bCs/>
+        </w:rPr>
+        <w:t xml:space="preserve">Featured Topics</w:t>
+      </w:r>
+      <w:r>
+        <w:t xml:space="preserve">, </w:t>
+      </w:r>
+      <w:r>
+        <w:rPr>
+          <w:b/>
+          <w:bCs/>
+        </w:rPr>
+        <w:t xml:space="preserve">Featured Services</w:t>
+      </w:r>
+      <w:r>
+        <w:t xml:space="preserve">).</w:t>
+      </w:r>
+    </w:p>
+    <w:p>
+      <w:pPr>
+        <w:pStyle w:val="ListParagraph"/>
+        <w:numPr>
+          <w:ilvl w:val="1"/>
+          <w:numId w:val="1"/>
+        </w:numPr>
+      </w:pPr>
       <w:r>
         <w:rPr>
           <w:b/>
@@ -3065,7 +3111,17 @@
         <w:t xml:space="preserve">Active</w:t>
       </w:r>
       <w:r>
-        <w:t xml:space="preserve">.</w:t>
+        <w:t xml:space="preserve">, last, before </w:t>
+      </w:r>
+      <w:r>
+        <w:rPr>
+          <w:b/>
+          <w:bCs/>
+        </w:rPr>
+        <w:t xml:space="preserve">Save</w:t>
+      </w:r>
+      <w:r>
+        <w:t xml:space="preserve">. Only you see it.</w:t>
       </w:r>
     </w:p>
     <w:p>
@@ -6771,7 +6827,7 @@
         <w:t xml:space="preserve">Media lists</w:t>
       </w:r>
       <w:r>
-        <w:t xml:space="preserve">.</w:t>
+        <w:t xml:space="preserve">. If you also have a News on Demand role, the screen's "Subscribers, Media lists" is a link there.</w:t>
       </w:r>
     </w:p>
     <w:p>

</xml_diff>

<commit_message>
37ea8451a2d9cc9aa680ded2aedc135d81c256e7 deploy: siteground artifact
</commit_message>
<xml_diff>
--- a/hub/manuals/core-admin.docx
+++ b/hub/manuals/core-admin.docx
@@ -2944,7 +2944,17 @@
         <w:t xml:space="preserve">Files</w:t>
       </w:r>
       <w:r>
-        <w:t xml:space="preserve"> first, then paste its address. A preview appears once the address starts with https://.</w:t>
+        <w:t xml:space="preserve"> first, choose </w:t>
+      </w:r>
+      <w:r>
+        <w:rPr>
+          <w:b/>
+          <w:bCs/>
+        </w:rPr>
+        <w:t xml:space="preserve">Copy public address</w:t>
+      </w:r>
+      <w:r>
+        <w:t xml:space="preserve"> beside it, then paste the address. A preview appears once the address starts with https://. An address copied from the Hub itself shows "This address points at the Hub, which the public can't open. On Website → Files, use Copy public address and paste that instead." Visitors couldn't see that photo.</w:t>
       </w:r>
     </w:p>
     <w:p>
@@ -7868,7 +7878,7 @@
         <w:spacing w:after="120"/>
       </w:pPr>
       <w:r>
-        <w:t xml:space="preserve">The page then shows "Project Blue Bridge is currently ON."</w:t>
+        <w:t xml:space="preserve">The page then shows "Project Blue Bridge is currently ON." and, below the switch, "Turned on at 2:30 PM. Live now: the public site shows it within a few minutes." (with the time).</w:t>
       </w:r>
     </w:p>
     <w:p>
@@ -8763,7 +8773,17 @@
         <w:t xml:space="preserve">Files</w:t>
       </w:r>
       <w:r>
-        <w:t xml:space="preserve"> first. See </w:t>
+        <w:t xml:space="preserve"> first, and paste each one's address from </w:t>
+      </w:r>
+      <w:r>
+        <w:rPr>
+          <w:b/>
+          <w:bCs/>
+        </w:rPr>
+        <w:t xml:space="preserve">Copy public address</w:t>
+      </w:r>
+      <w:r>
+        <w:t xml:space="preserve">. See </w:t>
       </w:r>
       <w:r>
         <w:t xml:space="preserve">Organizations</w:t>

</xml_diff>

<commit_message>
a8bd4d463030d76c2fb3aae8435e0f28c77f5418 deploy: siteground artifact
</commit_message>
<xml_diff>
--- a/hub/manuals/core-admin.docx
+++ b/hub/manuals/core-admin.docx
@@ -1978,6 +1978,22 @@
           <w:p>
             <w:r>
               <w:t xml:space="preserve">You tried to take Core Admin off yourself, or to deactivate yourself. Ask another Core administrator.</w:t>
+            </w:r>
+          </w:p>
+        </w:tc>
+      </w:tr>
+      <w:tr>
+        <w:tc>
+          <w:p>
+            <w:r>
+              <w:t xml:space="preserve">"this is the last active Core Admin: give Core Admin to someone else first, so someone can still manage users"</w:t>
+            </w:r>
+          </w:p>
+        </w:tc>
+        <w:tc>
+          <w:p>
+            <w:r>
+              <w:t xml:space="preserve">Nobody else who is active has Core Admin, so this change would leave no one able to manage users. Give another active person Core Admin first, then try again.</w:t>
             </w:r>
           </w:p>
         </w:tc>

</xml_diff>

<commit_message>
52e0072a0ebe209c669b67de17a1fdcc2a2fb91d deploy: siteground artifact
</commit_message>
<xml_diff>
--- a/hub/manuals/core-admin.docx
+++ b/hub/manuals/core-admin.docx
@@ -76,7 +76,7 @@
           <w:sz w:val="24"/>
           <w:szCs w:val="24"/>
         </w:rPr>
-        <w:t xml:space="preserve">Software version of October 31, 2026</w:t>
+        <w:t xml:space="preserve">Software version of November 1, 2026</w:t>
       </w:r>
     </w:p>
     <w:p>
@@ -552,6 +552,42 @@
                 <w:b/>
                 <w:bCs/>
               </w:rPr>
+              <w:t xml:space="preserve">Admin history</w:t>
+            </w:r>
+          </w:p>
+        </w:tc>
+        <w:tc>
+          <w:p>
+            <w:r>
+              <w:t xml:space="preserve">Nothing: it shows who changed what on Users, Calendar access, Organizations, Sectors, themes and tags, and Cabinet change.</w:t>
+            </w:r>
+          </w:p>
+        </w:tc>
+        <w:tc>
+          <w:p>
+            <w:r>
+              <w:t xml:space="preserve">Nobody.</w:t>
+            </w:r>
+          </w:p>
+        </w:tc>
+        <w:tc>
+          <w:p>
+            <w:hyperlink w:history="1" w:anchor="section_11">
+              <w:r>
+                <w:t xml:space="preserve">Admin history</w:t>
+              </w:r>
+            </w:hyperlink>
+          </w:p>
+        </w:tc>
+      </w:tr>
+      <w:tr>
+        <w:tc>
+          <w:p>
+            <w:r>
+              <w:rPr>
+                <w:b/>
+                <w:bCs/>
+              </w:rPr>
               <w:t xml:space="preserve">Website</w:t>
             </w:r>
             <w:r>
@@ -592,7 +628,7 @@
         </w:tc>
         <w:tc>
           <w:p>
-            <w:hyperlink w:history="1" w:anchor="section_11">
+            <w:hyperlink w:history="1" w:anchor="section_12">
               <w:r>
                 <w:t xml:space="preserve">Website and Project Blue Bridge</w:t>
               </w:r>
@@ -629,7 +665,7 @@
       <w:r>
         <w:t xml:space="preserve"> together. </w:t>
       </w:r>
-      <w:hyperlink w:history="1" w:anchor="section_12">
+      <w:hyperlink w:history="1" w:anchor="section_13">
         <w:r>
           <w:t xml:space="preserve">When a new government takes office</w:t>
         </w:r>
@@ -719,7 +755,7 @@
       <w:r>
         <w:t xml:space="preserve">The Hub keeps you signed in while its tab is open. </w:t>
       </w:r>
-      <w:hyperlink w:history="1" w:anchor="section_13">
+      <w:hyperlink w:history="1" w:anchor="section_14">
         <w:r>
           <w:t xml:space="preserve">Staying signed in, and unsaved changes</w:t>
         </w:r>
@@ -833,6 +869,16 @@
         <w:t xml:space="preserve">Roles</w:t>
       </w:r>
       <w:r>
+        <w:t xml:space="preserve">, </w:t>
+      </w:r>
+      <w:r>
+        <w:rPr>
+          <w:b/>
+          <w:bCs/>
+        </w:rPr>
+        <w:t xml:space="preserve">Status</w:t>
+      </w:r>
+      <w:r>
         <w:t xml:space="preserve"> and </w:t>
       </w:r>
       <w:r>
@@ -840,7 +886,7 @@
           <w:b/>
           <w:bCs/>
         </w:rPr>
-        <w:t xml:space="preserve">Status</w:t>
+        <w:t xml:space="preserve">Last signed in</w:t>
       </w:r>
       <w:r>
         <w:t xml:space="preserve">. A person with Calendar access also shows a line such as "Calendar: Editor (HLTH)"; you change that on </w:t>
@@ -1498,6 +1544,149 @@
         <w:pStyle w:val="Heading2"/>
       </w:pPr>
       <w:r>
+        <w:t xml:space="preserve">See who changed someone's account</w:t>
+      </w:r>
+    </w:p>
+    <w:p>
+      <w:pPr>
+        <w:pStyle w:val="ListParagraph"/>
+        <w:numPr>
+          <w:ilvl w:val="0"/>
+          <w:numId w:val="5"/>
+        </w:numPr>
+      </w:pPr>
+      <w:r>
+        <w:t xml:space="preserve">Choose </w:t>
+      </w:r>
+      <w:r>
+        <w:rPr>
+          <w:b/>
+          <w:bCs/>
+        </w:rPr>
+        <w:t xml:space="preserve">Edit</w:t>
+      </w:r>
+      <w:r>
+        <w:t xml:space="preserve"> on their row.</w:t>
+      </w:r>
+    </w:p>
+    <w:p>
+      <w:pPr>
+        <w:pStyle w:val="ListParagraph"/>
+        <w:numPr>
+          <w:ilvl w:val="0"/>
+          <w:numId w:val="5"/>
+        </w:numPr>
+      </w:pPr>
+      <w:r>
+        <w:t xml:space="preserve">At the bottom of their settings, open </w:t>
+      </w:r>
+      <w:r>
+        <w:rPr>
+          <w:b/>
+          <w:bCs/>
+        </w:rPr>
+        <w:t xml:space="preserve">History</w:t>
+      </w:r>
+      <w:r>
+        <w:t xml:space="preserve">. It lists each change to their account, newest first: when, who made it, and what they did, such as "Paul Smith gave Core Admin to Jo Lee".</w:t>
+      </w:r>
+    </w:p>
+    <w:p>
+      <w:pPr>
+        <w:pStyle w:val="ListParagraph"/>
+        <w:numPr>
+          <w:ilvl w:val="0"/>
+          <w:numId w:val="5"/>
+        </w:numPr>
+      </w:pPr>
+      <w:r>
+        <w:t xml:space="preserve">If there are more, choose </w:t>
+      </w:r>
+      <w:r>
+        <w:rPr>
+          <w:b/>
+          <w:bCs/>
+        </w:rPr>
+        <w:t xml:space="preserve">Show older changes</w:t>
+      </w:r>
+      <w:r>
+        <w:t xml:space="preserve">.</w:t>
+      </w:r>
+    </w:p>
+    <w:p>
+      <w:pPr>
+        <w:spacing w:after="120"/>
+      </w:pPr>
+      <w:r>
+        <w:t xml:space="preserve">History shows changes made on </w:t>
+      </w:r>
+      <w:r>
+        <w:rPr>
+          <w:b/>
+          <w:bCs/>
+        </w:rPr>
+        <w:t xml:space="preserve">Users</w:t>
+      </w:r>
+      <w:r>
+        <w:t xml:space="preserve"> and </w:t>
+      </w:r>
+      <w:r>
+        <w:rPr>
+          <w:b/>
+          <w:bCs/>
+        </w:rPr>
+        <w:t xml:space="preserve">Calendar access</w:t>
+      </w:r>
+      <w:r>
+        <w:t xml:space="preserve">: adding the person, their name, roles, Calendar role and ministries, password, linking, unlinking Microsoft sign-in, and switching </w:t>
+      </w:r>
+      <w:r>
+        <w:rPr>
+          <w:b/>
+          <w:bCs/>
+        </w:rPr>
+        <w:t xml:space="preserve">Active</w:t>
+      </w:r>
+      <w:r>
+        <w:t xml:space="preserve"> on or off. It also shows the person's own first Microsoft sign-in, which links their account, under their name. Changes made before the Hub started keeping this history aren't listed: you see "No changes recorded yet." The break-glass administrator shows as "Administrator (break-glass)". Every change on this screen, for everyone, is also on </w:t>
+      </w:r>
+      <w:hyperlink w:history="1" w:anchor="section_11">
+        <w:r>
+          <w:t xml:space="preserve">Admin history</w:t>
+        </w:r>
+      </w:hyperlink>
+      <w:r>
+        <w:t xml:space="preserve">.</w:t>
+      </w:r>
+    </w:p>
+    <w:p>
+      <w:pPr>
+        <w:pStyle w:val="Heading2"/>
+      </w:pPr>
+      <w:r>
+        <w:t xml:space="preserve">Check for accounts nobody uses</w:t>
+      </w:r>
+    </w:p>
+    <w:p>
+      <w:pPr>
+        <w:spacing w:after="120"/>
+      </w:pPr>
+      <w:r>
+        <w:rPr>
+          <w:b/>
+          <w:bCs/>
+        </w:rPr>
+        <w:t xml:space="preserve">Last signed in</w:t>
+      </w:r>
+      <w:r>
+        <w:t xml:space="preserve"> shows when the person last signed in with a password or Microsoft, in BC time, or "Never" if they haven't signed in since the Hub started keeping this. Use it in an access review: someone who hasn't signed in for months may no longer need their roles. Deactivate them, or take roles away, as for anyone else.</w:t>
+      </w:r>
+    </w:p>
+    <w:p>
+      <w:pPr>
+        <w:pStyle w:val="Heading2"/>
+      </w:pPr>
+      <w:r>
         <w:t xml:space="preserve">Deactivate or reactivate someone</w:t>
       </w:r>
     </w:p>
@@ -1506,7 +1695,7 @@
         <w:pStyle w:val="ListParagraph"/>
         <w:numPr>
           <w:ilvl w:val="0"/>
-          <w:numId w:val="5"/>
+          <w:numId w:val="6"/>
         </w:numPr>
       </w:pPr>
       <w:r>
@@ -1528,7 +1717,7 @@
         <w:pStyle w:val="ListParagraph"/>
         <w:numPr>
           <w:ilvl w:val="0"/>
-          <w:numId w:val="5"/>
+          <w:numId w:val="6"/>
         </w:numPr>
       </w:pPr>
       <w:r>
@@ -1550,7 +1739,7 @@
         <w:pStyle w:val="ListParagraph"/>
         <w:numPr>
           <w:ilvl w:val="0"/>
-          <w:numId w:val="5"/>
+          <w:numId w:val="6"/>
         </w:numPr>
       </w:pPr>
       <w:r>
@@ -1606,7 +1795,7 @@
         <w:pStyle w:val="ListParagraph"/>
         <w:numPr>
           <w:ilvl w:val="0"/>
-          <w:numId w:val="6"/>
+          <w:numId w:val="7"/>
         </w:numPr>
       </w:pPr>
       <w:r>
@@ -1628,7 +1817,7 @@
         <w:pStyle w:val="ListParagraph"/>
         <w:numPr>
           <w:ilvl w:val="0"/>
-          <w:numId w:val="6"/>
+          <w:numId w:val="7"/>
         </w:numPr>
       </w:pPr>
       <w:r>
@@ -1650,7 +1839,7 @@
         <w:pStyle w:val="ListParagraph"/>
         <w:numPr>
           <w:ilvl w:val="0"/>
-          <w:numId w:val="6"/>
+          <w:numId w:val="7"/>
         </w:numPr>
       </w:pPr>
       <w:r>
@@ -1708,7 +1897,7 @@
         <w:pStyle w:val="ListParagraph"/>
         <w:numPr>
           <w:ilvl w:val="0"/>
-          <w:numId w:val="7"/>
+          <w:numId w:val="8"/>
         </w:numPr>
       </w:pPr>
       <w:r>
@@ -1730,7 +1919,7 @@
         <w:pStyle w:val="ListParagraph"/>
         <w:numPr>
           <w:ilvl w:val="0"/>
-          <w:numId w:val="7"/>
+          <w:numId w:val="8"/>
         </w:numPr>
       </w:pPr>
       <w:r>
@@ -1762,7 +1951,7 @@
         <w:pStyle w:val="ListParagraph"/>
         <w:numPr>
           <w:ilvl w:val="0"/>
-          <w:numId w:val="7"/>
+          <w:numId w:val="8"/>
         </w:numPr>
       </w:pPr>
       <w:r>
@@ -2277,7 +2466,7 @@
         <w:pStyle w:val="ListParagraph"/>
         <w:numPr>
           <w:ilvl w:val="0"/>
-          <w:numId w:val="8"/>
+          <w:numId w:val="9"/>
         </w:numPr>
       </w:pPr>
       <w:r>
@@ -2299,7 +2488,7 @@
         <w:pStyle w:val="ListParagraph"/>
         <w:numPr>
           <w:ilvl w:val="0"/>
-          <w:numId w:val="8"/>
+          <w:numId w:val="9"/>
         </w:numPr>
       </w:pPr>
       <w:r>
@@ -2321,7 +2510,7 @@
         <w:pStyle w:val="ListParagraph"/>
         <w:numPr>
           <w:ilvl w:val="0"/>
-          <w:numId w:val="8"/>
+          <w:numId w:val="9"/>
         </w:numPr>
       </w:pPr>
       <w:r>
@@ -2343,7 +2532,7 @@
         <w:pStyle w:val="ListParagraph"/>
         <w:numPr>
           <w:ilvl w:val="0"/>
-          <w:numId w:val="8"/>
+          <w:numId w:val="9"/>
         </w:numPr>
       </w:pPr>
       <w:r>
@@ -2365,7 +2554,7 @@
         <w:pStyle w:val="ListParagraph"/>
         <w:numPr>
           <w:ilvl w:val="0"/>
-          <w:numId w:val="8"/>
+          <w:numId w:val="9"/>
         </w:numPr>
       </w:pPr>
       <w:r>
@@ -2403,7 +2592,7 @@
         <w:pStyle w:val="ListParagraph"/>
         <w:numPr>
           <w:ilvl w:val="0"/>
-          <w:numId w:val="9"/>
+          <w:numId w:val="10"/>
         </w:numPr>
       </w:pPr>
       <w:r>
@@ -2425,7 +2614,7 @@
         <w:pStyle w:val="ListParagraph"/>
         <w:numPr>
           <w:ilvl w:val="0"/>
-          <w:numId w:val="9"/>
+          <w:numId w:val="10"/>
         </w:numPr>
       </w:pPr>
       <w:r>
@@ -2457,7 +2646,7 @@
         <w:pStyle w:val="ListParagraph"/>
         <w:numPr>
           <w:ilvl w:val="0"/>
-          <w:numId w:val="9"/>
+          <w:numId w:val="10"/>
         </w:numPr>
       </w:pPr>
       <w:r>
@@ -2914,7 +3103,7 @@
         <w:pStyle w:val="ListParagraph"/>
         <w:numPr>
           <w:ilvl w:val="0"/>
-          <w:numId w:val="10"/>
+          <w:numId w:val="11"/>
         </w:numPr>
       </w:pPr>
       <w:r>
@@ -2936,7 +3125,7 @@
         <w:pStyle w:val="ListParagraph"/>
         <w:numPr>
           <w:ilvl w:val="0"/>
-          <w:numId w:val="10"/>
+          <w:numId w:val="11"/>
         </w:numPr>
       </w:pPr>
       <w:r>
@@ -3281,7 +3470,7 @@
         <w:pStyle w:val="ListParagraph"/>
         <w:numPr>
           <w:ilvl w:val="0"/>
-          <w:numId w:val="10"/>
+          <w:numId w:val="11"/>
         </w:numPr>
       </w:pPr>
       <w:r>
@@ -3327,6 +3516,126 @@
         <w:pStyle w:val="Heading2"/>
       </w:pPr>
       <w:r>
+        <w:t xml:space="preserve">See who changed a ministry</w:t>
+      </w:r>
+    </w:p>
+    <w:p>
+      <w:pPr>
+        <w:pStyle w:val="ListParagraph"/>
+        <w:numPr>
+          <w:ilvl w:val="0"/>
+          <w:numId w:val="12"/>
+        </w:numPr>
+      </w:pPr>
+      <w:r>
+        <w:t xml:space="preserve">Choose </w:t>
+      </w:r>
+      <w:r>
+        <w:rPr>
+          <w:b/>
+          <w:bCs/>
+        </w:rPr>
+        <w:t xml:space="preserve">Edit</w:t>
+      </w:r>
+      <w:r>
+        <w:t xml:space="preserve"> on the ministry's row.</w:t>
+      </w:r>
+    </w:p>
+    <w:p>
+      <w:pPr>
+        <w:pStyle w:val="ListParagraph"/>
+        <w:numPr>
+          <w:ilvl w:val="0"/>
+          <w:numId w:val="12"/>
+        </w:numPr>
+      </w:pPr>
+      <w:r>
+        <w:t xml:space="preserve">Under the form, open </w:t>
+      </w:r>
+      <w:r>
+        <w:rPr>
+          <w:b/>
+          <w:bCs/>
+        </w:rPr>
+        <w:t xml:space="preserve">History</w:t>
+      </w:r>
+      <w:r>
+        <w:t xml:space="preserve">. It lists each change to the ministry, newest first: when, who made it, and what they did, such as "Paul Smith renamed Ministry of X to Ministry of Y".</w:t>
+      </w:r>
+    </w:p>
+    <w:p>
+      <w:pPr>
+        <w:pStyle w:val="ListParagraph"/>
+        <w:numPr>
+          <w:ilvl w:val="0"/>
+          <w:numId w:val="12"/>
+        </w:numPr>
+      </w:pPr>
+      <w:r>
+        <w:t xml:space="preserve">If there are more, choose </w:t>
+      </w:r>
+      <w:r>
+        <w:rPr>
+          <w:b/>
+          <w:bCs/>
+        </w:rPr>
+        <w:t xml:space="preserve">Show older changes</w:t>
+      </w:r>
+      <w:r>
+        <w:t xml:space="preserve">.</w:t>
+      </w:r>
+    </w:p>
+    <w:p>
+      <w:pPr>
+        <w:spacing w:after="120"/>
+      </w:pPr>
+      <w:r>
+        <w:t xml:space="preserve">History covers adding the ministry, edits to its details (it names what changed, such as the minister or Featured Topics, without copying them), its name and abbreviation, </w:t>
+      </w:r>
+      <w:r>
+        <w:rPr>
+          <w:b/>
+          <w:bCs/>
+        </w:rPr>
+        <w:t xml:space="preserve">HQ</w:t>
+      </w:r>
+      <w:r>
+        <w:t xml:space="preserve">, </w:t>
+      </w:r>
+      <w:r>
+        <w:rPr>
+          <w:b/>
+          <w:bCs/>
+        </w:rPr>
+        <w:t xml:space="preserve">Public</w:t>
+      </w:r>
+      <w:r>
+        <w:t xml:space="preserve">, deactivating, reactivating and handing over. A change a published cabinet change made ends "(cabinet change)"; an abbreviation a successor took in a hand-over ends "(hand-over)". Site editors don't see </w:t>
+      </w:r>
+      <w:r>
+        <w:rPr>
+          <w:b/>
+          <w:bCs/>
+        </w:rPr>
+        <w:t xml:space="preserve">History</w:t>
+      </w:r>
+      <w:r>
+        <w:t xml:space="preserve">. Every change, for every ministry, is also on </w:t>
+      </w:r>
+      <w:hyperlink w:history="1" w:anchor="section_11">
+        <w:r>
+          <w:t xml:space="preserve">Admin history</w:t>
+        </w:r>
+      </w:hyperlink>
+      <w:r>
+        <w:t xml:space="preserve">.</w:t>
+      </w:r>
+    </w:p>
+    <w:p>
+      <w:pPr>
+        <w:pStyle w:val="Heading2"/>
+      </w:pPr>
+      <w:r>
         <w:t xml:space="preserve">Add a ministry</w:t>
       </w:r>
     </w:p>
@@ -3335,7 +3644,7 @@
         <w:pStyle w:val="ListParagraph"/>
         <w:numPr>
           <w:ilvl w:val="0"/>
-          <w:numId w:val="11"/>
+          <w:numId w:val="13"/>
         </w:numPr>
       </w:pPr>
       <w:r>
@@ -3357,7 +3666,7 @@
         <w:pStyle w:val="ListParagraph"/>
         <w:numPr>
           <w:ilvl w:val="0"/>
-          <w:numId w:val="11"/>
+          <w:numId w:val="13"/>
         </w:numPr>
       </w:pPr>
       <w:r>
@@ -3379,7 +3688,7 @@
         <w:pStyle w:val="ListParagraph"/>
         <w:numPr>
           <w:ilvl w:val="0"/>
-          <w:numId w:val="11"/>
+          <w:numId w:val="13"/>
         </w:numPr>
       </w:pPr>
       <w:r>
@@ -3401,7 +3710,7 @@
         <w:pStyle w:val="ListParagraph"/>
         <w:numPr>
           <w:ilvl w:val="0"/>
-          <w:numId w:val="11"/>
+          <w:numId w:val="13"/>
         </w:numPr>
       </w:pPr>
       <w:r>
@@ -3523,7 +3832,7 @@
         <w:pStyle w:val="ListParagraph"/>
         <w:numPr>
           <w:ilvl w:val="0"/>
-          <w:numId w:val="12"/>
+          <w:numId w:val="14"/>
         </w:numPr>
       </w:pPr>
       <w:r>
@@ -3545,7 +3854,7 @@
         <w:pStyle w:val="ListParagraph"/>
         <w:numPr>
           <w:ilvl w:val="0"/>
-          <w:numId w:val="12"/>
+          <w:numId w:val="14"/>
         </w:numPr>
       </w:pPr>
       <w:r>
@@ -3577,7 +3886,7 @@
         <w:pStyle w:val="ListParagraph"/>
         <w:numPr>
           <w:ilvl w:val="0"/>
-          <w:numId w:val="12"/>
+          <w:numId w:val="14"/>
         </w:numPr>
       </w:pPr>
       <w:r>
@@ -3661,7 +3970,7 @@
         <w:pStyle w:val="ListParagraph"/>
         <w:numPr>
           <w:ilvl w:val="0"/>
-          <w:numId w:val="12"/>
+          <w:numId w:val="14"/>
         </w:numPr>
       </w:pPr>
       <w:r>
@@ -3793,7 +4102,7 @@
         <w:pStyle w:val="ListParagraph"/>
         <w:numPr>
           <w:ilvl w:val="0"/>
-          <w:numId w:val="13"/>
+          <w:numId w:val="15"/>
         </w:numPr>
       </w:pPr>
       <w:r>
@@ -3815,7 +4124,7 @@
         <w:pStyle w:val="ListParagraph"/>
         <w:numPr>
           <w:ilvl w:val="0"/>
-          <w:numId w:val="13"/>
+          <w:numId w:val="15"/>
         </w:numPr>
       </w:pPr>
       <w:r>
@@ -4280,7 +4589,7 @@
         <w:pStyle w:val="ListParagraph"/>
         <w:numPr>
           <w:ilvl w:val="0"/>
-          <w:numId w:val="14"/>
+          <w:numId w:val="16"/>
         </w:numPr>
       </w:pPr>
       <w:r>
@@ -4457,7 +4766,7 @@
         <w:pStyle w:val="ListParagraph"/>
         <w:numPr>
           <w:ilvl w:val="0"/>
-          <w:numId w:val="14"/>
+          <w:numId w:val="16"/>
         </w:numPr>
       </w:pPr>
       <w:r>
@@ -4502,7 +4811,7 @@
         <w:pStyle w:val="ListParagraph"/>
         <w:numPr>
           <w:ilvl w:val="0"/>
-          <w:numId w:val="15"/>
+          <w:numId w:val="17"/>
         </w:numPr>
       </w:pPr>
       <w:r>
@@ -4524,7 +4833,7 @@
         <w:pStyle w:val="ListParagraph"/>
         <w:numPr>
           <w:ilvl w:val="0"/>
-          <w:numId w:val="15"/>
+          <w:numId w:val="17"/>
         </w:numPr>
       </w:pPr>
       <w:r>
@@ -4556,7 +4865,7 @@
         <w:pStyle w:val="ListParagraph"/>
         <w:numPr>
           <w:ilvl w:val="0"/>
-          <w:numId w:val="15"/>
+          <w:numId w:val="17"/>
         </w:numPr>
       </w:pPr>
       <w:r>
@@ -4594,7 +4903,7 @@
         <w:pStyle w:val="ListParagraph"/>
         <w:numPr>
           <w:ilvl w:val="0"/>
-          <w:numId w:val="16"/>
+          <w:numId w:val="18"/>
         </w:numPr>
       </w:pPr>
       <w:r>
@@ -4626,7 +4935,7 @@
         <w:pStyle w:val="ListParagraph"/>
         <w:numPr>
           <w:ilvl w:val="0"/>
-          <w:numId w:val="16"/>
+          <w:numId w:val="18"/>
         </w:numPr>
       </w:pPr>
       <w:r>
@@ -4674,7 +4983,7 @@
         <w:pStyle w:val="ListParagraph"/>
         <w:numPr>
           <w:ilvl w:val="0"/>
-          <w:numId w:val="17"/>
+          <w:numId w:val="19"/>
         </w:numPr>
       </w:pPr>
       <w:r>
@@ -4706,7 +5015,7 @@
         <w:pStyle w:val="ListParagraph"/>
         <w:numPr>
           <w:ilvl w:val="0"/>
-          <w:numId w:val="17"/>
+          <w:numId w:val="19"/>
         </w:numPr>
       </w:pPr>
       <w:r>
@@ -4738,7 +5047,7 @@
         <w:pStyle w:val="ListParagraph"/>
         <w:numPr>
           <w:ilvl w:val="0"/>
-          <w:numId w:val="17"/>
+          <w:numId w:val="19"/>
         </w:numPr>
       </w:pPr>
       <w:r>
@@ -5305,7 +5614,7 @@
         <w:pStyle w:val="ListParagraph"/>
         <w:numPr>
           <w:ilvl w:val="0"/>
-          <w:numId w:val="18"/>
+          <w:numId w:val="20"/>
         </w:numPr>
       </w:pPr>
       <w:r>
@@ -5327,7 +5636,7 @@
         <w:pStyle w:val="ListParagraph"/>
         <w:numPr>
           <w:ilvl w:val="0"/>
-          <w:numId w:val="18"/>
+          <w:numId w:val="20"/>
         </w:numPr>
       </w:pPr>
       <w:r>
@@ -5349,7 +5658,7 @@
         <w:pStyle w:val="ListParagraph"/>
         <w:numPr>
           <w:ilvl w:val="0"/>
-          <w:numId w:val="18"/>
+          <w:numId w:val="20"/>
         </w:numPr>
       </w:pPr>
       <w:r>
@@ -5371,7 +5680,7 @@
         <w:pStyle w:val="ListParagraph"/>
         <w:numPr>
           <w:ilvl w:val="0"/>
-          <w:numId w:val="18"/>
+          <w:numId w:val="20"/>
         </w:numPr>
       </w:pPr>
       <w:r>
@@ -5393,7 +5702,7 @@
         <w:pStyle w:val="ListParagraph"/>
         <w:numPr>
           <w:ilvl w:val="0"/>
-          <w:numId w:val="18"/>
+          <w:numId w:val="20"/>
         </w:numPr>
       </w:pPr>
       <w:r>
@@ -5405,7 +5714,7 @@
         <w:pStyle w:val="ListParagraph"/>
         <w:numPr>
           <w:ilvl w:val="0"/>
-          <w:numId w:val="18"/>
+          <w:numId w:val="20"/>
         </w:numPr>
       </w:pPr>
       <w:r>
@@ -5453,7 +5762,7 @@
         <w:pStyle w:val="ListParagraph"/>
         <w:numPr>
           <w:ilvl w:val="0"/>
-          <w:numId w:val="19"/>
+          <w:numId w:val="21"/>
         </w:numPr>
       </w:pPr>
       <w:r>
@@ -5475,7 +5784,7 @@
         <w:pStyle w:val="ListParagraph"/>
         <w:numPr>
           <w:ilvl w:val="0"/>
-          <w:numId w:val="19"/>
+          <w:numId w:val="21"/>
         </w:numPr>
       </w:pPr>
       <w:r>
@@ -5517,7 +5826,7 @@
         <w:pStyle w:val="ListParagraph"/>
         <w:numPr>
           <w:ilvl w:val="0"/>
-          <w:numId w:val="19"/>
+          <w:numId w:val="21"/>
         </w:numPr>
       </w:pPr>
       <w:r>
@@ -5539,7 +5848,7 @@
         <w:pStyle w:val="ListParagraph"/>
         <w:numPr>
           <w:ilvl w:val="0"/>
-          <w:numId w:val="19"/>
+          <w:numId w:val="21"/>
         </w:numPr>
       </w:pPr>
       <w:r>
@@ -5592,7 +5901,7 @@
         <w:pStyle w:val="ListParagraph"/>
         <w:numPr>
           <w:ilvl w:val="0"/>
-          <w:numId w:val="20"/>
+          <w:numId w:val="22"/>
         </w:numPr>
       </w:pPr>
       <w:r>
@@ -5614,7 +5923,7 @@
         <w:pStyle w:val="ListParagraph"/>
         <w:numPr>
           <w:ilvl w:val="0"/>
-          <w:numId w:val="20"/>
+          <w:numId w:val="22"/>
         </w:numPr>
       </w:pPr>
       <w:r>
@@ -5629,6 +5938,72 @@
       </w:r>
       <w:r>
         <w:t xml:space="preserve">. You see "The term starting {date} is deleted."</w:t>
+      </w:r>
+    </w:p>
+    <w:p>
+      <w:pPr>
+        <w:pStyle w:val="Heading2"/>
+      </w:pPr>
+      <w:r>
+        <w:t xml:space="preserve">See who changed a term</w:t>
+      </w:r>
+    </w:p>
+    <w:p>
+      <w:pPr>
+        <w:spacing w:after="120"/>
+      </w:pPr>
+      <w:r>
+        <w:t xml:space="preserve">Each start, date change, name change, old archive address change and deletion is listed in </w:t>
+      </w:r>
+      <w:r>
+        <w:rPr>
+          <w:b/>
+          <w:bCs/>
+        </w:rPr>
+        <w:t xml:space="preserve">Website</w:t>
+      </w:r>
+      <w:r>
+        <w:t xml:space="preserve"> &gt; </w:t>
+      </w:r>
+      <w:r>
+        <w:rPr>
+          <w:b/>
+          <w:bCs/>
+        </w:rPr>
+        <w:t xml:space="preserve">Website log</w:t>
+      </w:r>
+      <w:r>
+        <w:t xml:space="preserve">, with who made it and when. Choose </w:t>
+      </w:r>
+      <w:r>
+        <w:rPr>
+          <w:b/>
+          <w:bCs/>
+        </w:rPr>
+        <w:t xml:space="preserve">Government terms</w:t>
+      </w:r>
+      <w:r>
+        <w:t xml:space="preserve"> in </w:t>
+      </w:r>
+      <w:r>
+        <w:rPr>
+          <w:b/>
+          <w:bCs/>
+        </w:rPr>
+        <w:t xml:space="preserve">Filter by area</w:t>
+      </w:r>
+      <w:r>
+        <w:t xml:space="preserve">. For example: "Moved the start of the government term starting November 20, 2028 to November 21, 2028". Only Core administrators see these lines and the </w:t>
+      </w:r>
+      <w:r>
+        <w:rPr>
+          <w:b/>
+          <w:bCs/>
+        </w:rPr>
+        <w:t xml:space="preserve">Government terms</w:t>
+      </w:r>
+      <w:r>
+        <w:t xml:space="preserve"> filter.</w:t>
       </w:r>
     </w:p>
     <w:p>
@@ -6057,7 +6432,7 @@
         <w:pStyle w:val="ListParagraph"/>
         <w:numPr>
           <w:ilvl w:val="0"/>
-          <w:numId w:val="21"/>
+          <w:numId w:val="23"/>
         </w:numPr>
       </w:pPr>
       <w:r>
@@ -6089,7 +6464,7 @@
         <w:pStyle w:val="ListParagraph"/>
         <w:numPr>
           <w:ilvl w:val="0"/>
-          <w:numId w:val="21"/>
+          <w:numId w:val="23"/>
         </w:numPr>
       </w:pPr>
       <w:r>
@@ -6111,7 +6486,7 @@
         <w:pStyle w:val="ListParagraph"/>
         <w:numPr>
           <w:ilvl w:val="0"/>
-          <w:numId w:val="21"/>
+          <w:numId w:val="23"/>
         </w:numPr>
       </w:pPr>
       <w:r>
@@ -6123,7 +6498,7 @@
         <w:pStyle w:val="ListParagraph"/>
         <w:numPr>
           <w:ilvl w:val="0"/>
-          <w:numId w:val="21"/>
+          <w:numId w:val="23"/>
         </w:numPr>
       </w:pPr>
       <w:r>
@@ -6171,7 +6546,7 @@
         <w:pStyle w:val="ListParagraph"/>
         <w:numPr>
           <w:ilvl w:val="0"/>
-          <w:numId w:val="22"/>
+          <w:numId w:val="24"/>
         </w:numPr>
       </w:pPr>
       <w:r>
@@ -6193,7 +6568,7 @@
         <w:pStyle w:val="ListParagraph"/>
         <w:numPr>
           <w:ilvl w:val="0"/>
-          <w:numId w:val="22"/>
+          <w:numId w:val="24"/>
         </w:numPr>
       </w:pPr>
       <w:r>
@@ -6235,7 +6610,7 @@
         <w:pStyle w:val="ListParagraph"/>
         <w:numPr>
           <w:ilvl w:val="0"/>
-          <w:numId w:val="22"/>
+          <w:numId w:val="24"/>
         </w:numPr>
       </w:pPr>
       <w:r>
@@ -6662,7 +7037,7 @@
         <w:pStyle w:val="ListParagraph"/>
         <w:numPr>
           <w:ilvl w:val="0"/>
-          <w:numId w:val="23"/>
+          <w:numId w:val="25"/>
         </w:numPr>
       </w:pPr>
       <w:r>
@@ -6674,7 +7049,7 @@
         <w:pStyle w:val="ListParagraph"/>
         <w:numPr>
           <w:ilvl w:val="0"/>
-          <w:numId w:val="23"/>
+          <w:numId w:val="25"/>
         </w:numPr>
       </w:pPr>
       <w:r>
@@ -6704,7 +7079,7 @@
         <w:pStyle w:val="ListParagraph"/>
         <w:numPr>
           <w:ilvl w:val="0"/>
-          <w:numId w:val="24"/>
+          <w:numId w:val="26"/>
         </w:numPr>
       </w:pPr>
       <w:r>
@@ -6736,7 +7111,7 @@
         <w:pStyle w:val="ListParagraph"/>
         <w:numPr>
           <w:ilvl w:val="0"/>
-          <w:numId w:val="24"/>
+          <w:numId w:val="26"/>
         </w:numPr>
       </w:pPr>
       <w:r>
@@ -6758,7 +7133,7 @@
         <w:pStyle w:val="ListParagraph"/>
         <w:numPr>
           <w:ilvl w:val="0"/>
-          <w:numId w:val="24"/>
+          <w:numId w:val="26"/>
         </w:numPr>
       </w:pPr>
       <w:r>
@@ -6790,7 +7165,7 @@
         <w:pStyle w:val="ListParagraph"/>
         <w:numPr>
           <w:ilvl w:val="0"/>
-          <w:numId w:val="24"/>
+          <w:numId w:val="26"/>
         </w:numPr>
       </w:pPr>
       <w:r>
@@ -6812,7 +7187,7 @@
         <w:pStyle w:val="ListParagraph"/>
         <w:numPr>
           <w:ilvl w:val="0"/>
-          <w:numId w:val="24"/>
+          <w:numId w:val="26"/>
         </w:numPr>
       </w:pPr>
       <w:r>
@@ -6844,7 +7219,7 @@
         <w:pStyle w:val="ListParagraph"/>
         <w:numPr>
           <w:ilvl w:val="0"/>
-          <w:numId w:val="24"/>
+          <w:numId w:val="26"/>
         </w:numPr>
       </w:pPr>
       <w:r>
@@ -6874,7 +7249,7 @@
         <w:pStyle w:val="ListParagraph"/>
         <w:numPr>
           <w:ilvl w:val="0"/>
-          <w:numId w:val="25"/>
+          <w:numId w:val="27"/>
         </w:numPr>
       </w:pPr>
       <w:r>
@@ -6896,7 +7271,7 @@
         <w:pStyle w:val="ListParagraph"/>
         <w:numPr>
           <w:ilvl w:val="0"/>
-          <w:numId w:val="25"/>
+          <w:numId w:val="27"/>
         </w:numPr>
       </w:pPr>
       <w:r>
@@ -7293,7 +7668,7 @@
         <w:pStyle w:val="ListParagraph"/>
         <w:numPr>
           <w:ilvl w:val="0"/>
-          <w:numId w:val="26"/>
+          <w:numId w:val="28"/>
         </w:numPr>
       </w:pPr>
       <w:r>
@@ -7325,7 +7700,7 @@
         <w:pStyle w:val="ListParagraph"/>
         <w:numPr>
           <w:ilvl w:val="0"/>
-          <w:numId w:val="26"/>
+          <w:numId w:val="28"/>
         </w:numPr>
       </w:pPr>
       <w:r>
@@ -7355,7 +7730,7 @@
         <w:pStyle w:val="ListParagraph"/>
         <w:numPr>
           <w:ilvl w:val="0"/>
-          <w:numId w:val="27"/>
+          <w:numId w:val="29"/>
         </w:numPr>
       </w:pPr>
       <w:r>
@@ -7377,7 +7752,7 @@
         <w:pStyle w:val="ListParagraph"/>
         <w:numPr>
           <w:ilvl w:val="0"/>
-          <w:numId w:val="27"/>
+          <w:numId w:val="29"/>
         </w:numPr>
       </w:pPr>
       <w:r>
@@ -7399,7 +7774,7 @@
         <w:pStyle w:val="ListParagraph"/>
         <w:numPr>
           <w:ilvl w:val="0"/>
-          <w:numId w:val="27"/>
+          <w:numId w:val="29"/>
         </w:numPr>
       </w:pPr>
       <w:r>
@@ -7429,7 +7804,7 @@
         <w:pStyle w:val="ListParagraph"/>
         <w:numPr>
           <w:ilvl w:val="0"/>
-          <w:numId w:val="28"/>
+          <w:numId w:val="30"/>
         </w:numPr>
       </w:pPr>
       <w:r>
@@ -7461,7 +7836,7 @@
         <w:pStyle w:val="ListParagraph"/>
         <w:numPr>
           <w:ilvl w:val="0"/>
-          <w:numId w:val="28"/>
+          <w:numId w:val="30"/>
         </w:numPr>
       </w:pPr>
       <w:r>
@@ -7483,7 +7858,7 @@
         <w:pStyle w:val="ListParagraph"/>
         <w:numPr>
           <w:ilvl w:val="0"/>
-          <w:numId w:val="28"/>
+          <w:numId w:val="30"/>
         </w:numPr>
       </w:pPr>
       <w:r>
@@ -7776,7 +8151,7 @@
         <w:pStyle w:val="ListParagraph"/>
         <w:numPr>
           <w:ilvl w:val="0"/>
-          <w:numId w:val="29"/>
+          <w:numId w:val="31"/>
         </w:numPr>
       </w:pPr>
       <w:r>
@@ -7798,7 +8173,7 @@
         <w:pStyle w:val="ListParagraph"/>
         <w:numPr>
           <w:ilvl w:val="0"/>
-          <w:numId w:val="29"/>
+          <w:numId w:val="31"/>
         </w:numPr>
       </w:pPr>
       <w:r>
@@ -7820,7 +8195,7 @@
         <w:pStyle w:val="ListParagraph"/>
         <w:numPr>
           <w:ilvl w:val="0"/>
-          <w:numId w:val="29"/>
+          <w:numId w:val="31"/>
         </w:numPr>
       </w:pPr>
       <w:r>
@@ -7925,7 +8300,7 @@
       </w:pPr>
       <w:bookmarkStart w:name="section_11" w:id="11"/>
       <w:r>
-        <w:t xml:space="preserve">Website and Project Blue Bridge</w:t>
+        <w:t xml:space="preserve">Admin history</w:t>
       </w:r>
       <w:bookmarkEnd w:id="11"/>
     </w:p>
@@ -7949,37 +8324,112 @@
         <w:spacing w:after="120"/>
       </w:pPr>
       <w:r>
-        <w:t xml:space="preserve">In </w:t>
-      </w:r>
-      <w:r>
-        <w:rPr>
-          <w:b/>
-          <w:bCs/>
-        </w:rPr>
-        <w:t xml:space="preserve">Website</w:t>
-      </w:r>
-      <w:r>
-        <w:t xml:space="preserve">, the one thing only you can change is </w:t>
-      </w:r>
-      <w:r>
-        <w:rPr>
-          <w:b/>
-          <w:bCs/>
-        </w:rPr>
-        <w:t xml:space="preserve">Project Blue Bridge</w:t>
-      </w:r>
-      <w:r>
-        <w:t xml:space="preserve">: the switch that puts the public site into mourning when the King dies. Everything else in </w:t>
-      </w:r>
-      <w:r>
-        <w:rPr>
-          <w:b/>
-          <w:bCs/>
-        </w:rPr>
-        <w:t xml:space="preserve">Website</w:t>
-      </w:r>
-      <w:r>
-        <w:t xml:space="preserve"> is view-only for you.</w:t>
+        <w:rPr>
+          <w:b/>
+          <w:bCs/>
+        </w:rPr>
+        <w:t xml:space="preserve">Admin history</w:t>
+      </w:r>
+      <w:r>
+        <w:t xml:space="preserve"> answers "who changed this, and when?" for the administration screens: </w:t>
+      </w:r>
+      <w:r>
+        <w:rPr>
+          <w:b/>
+          <w:bCs/>
+        </w:rPr>
+        <w:t xml:space="preserve">Users</w:t>
+      </w:r>
+      <w:r>
+        <w:t xml:space="preserve">, </w:t>
+      </w:r>
+      <w:r>
+        <w:rPr>
+          <w:b/>
+          <w:bCs/>
+        </w:rPr>
+        <w:t xml:space="preserve">Calendar access</w:t>
+      </w:r>
+      <w:r>
+        <w:t xml:space="preserve">, </w:t>
+      </w:r>
+      <w:r>
+        <w:rPr>
+          <w:b/>
+          <w:bCs/>
+        </w:rPr>
+        <w:t xml:space="preserve">Organizations</w:t>
+      </w:r>
+      <w:r>
+        <w:t xml:space="preserve">, </w:t>
+      </w:r>
+      <w:r>
+        <w:rPr>
+          <w:b/>
+          <w:bCs/>
+        </w:rPr>
+        <w:t xml:space="preserve">Sectors, themes and tags</w:t>
+      </w:r>
+      <w:r>
+        <w:t xml:space="preserve"> and </w:t>
+      </w:r>
+      <w:r>
+        <w:rPr>
+          <w:b/>
+          <w:bCs/>
+        </w:rPr>
+        <w:t xml:space="preserve">Cabinet change</w:t>
+      </w:r>
+      <w:r>
+        <w:t xml:space="preserve">. It changes nothing. Only Core administrators see it.</w:t>
+      </w:r>
+    </w:p>
+    <w:p>
+      <w:pPr>
+        <w:spacing w:after="120"/>
+      </w:pPr>
+      <w:r>
+        <w:t xml:space="preserve">Each change is listed with </w:t>
+      </w:r>
+      <w:r>
+        <w:rPr>
+          <w:b/>
+          <w:bCs/>
+        </w:rPr>
+        <w:t xml:space="preserve">When</w:t>
+      </w:r>
+      <w:r>
+        <w:t xml:space="preserve"> (BC time), </w:t>
+      </w:r>
+      <w:r>
+        <w:rPr>
+          <w:b/>
+          <w:bCs/>
+        </w:rPr>
+        <w:t xml:space="preserve">Who</w:t>
+      </w:r>
+      <w:r>
+        <w:t xml:space="preserve"> made it and </w:t>
+      </w:r>
+      <w:r>
+        <w:rPr>
+          <w:b/>
+          <w:bCs/>
+        </w:rPr>
+        <w:t xml:space="preserve">What</w:t>
+      </w:r>
+      <w:r>
+        <w:t xml:space="preserve"> they did, newest first, such as "Gave Core Admin to Jo Lee" or "Renamed Ministry of X to Ministry of Y". Names are as they were at the time. Changes made by a Calendar administrator on </w:t>
+      </w:r>
+      <w:r>
+        <w:rPr>
+          <w:b/>
+          <w:bCs/>
+        </w:rPr>
+        <w:t xml:space="preserve">Calendar access</w:t>
+      </w:r>
+      <w:r>
+        <w:t xml:space="preserve"> are listed under their own name. The break-glass administrator shows as "Administrator (break-glass)". A cabinet change that published on its own at its scheduled time shows as "Scheduled cabinet change".</w:t>
       </w:r>
     </w:p>
     <w:p>
@@ -7987,7 +8437,222 @@
         <w:pStyle w:val="Heading2"/>
       </w:pPr>
       <w:r>
-        <w:t xml:space="preserve">What you can and can't change in Website</w:t>
+        <w:t xml:space="preserve">Find a change</w:t>
+      </w:r>
+    </w:p>
+    <w:p>
+      <w:pPr>
+        <w:pStyle w:val="ListParagraph"/>
+        <w:numPr>
+          <w:ilvl w:val="0"/>
+          <w:numId w:val="32"/>
+        </w:numPr>
+      </w:pPr>
+      <w:r>
+        <w:t xml:space="preserve">Open </w:t>
+      </w:r>
+      <w:r>
+        <w:rPr>
+          <w:b/>
+          <w:bCs/>
+        </w:rPr>
+        <w:t xml:space="preserve">Admin history</w:t>
+      </w:r>
+      <w:r>
+        <w:t xml:space="preserve">. It shows the 50 most recent changes.</w:t>
+      </w:r>
+    </w:p>
+    <w:p>
+      <w:pPr>
+        <w:pStyle w:val="ListParagraph"/>
+        <w:numPr>
+          <w:ilvl w:val="0"/>
+          <w:numId w:val="32"/>
+        </w:numPr>
+      </w:pPr>
+      <w:r>
+        <w:t xml:space="preserve">Narrow the list, using any of these:</w:t>
+      </w:r>
+    </w:p>
+    <w:p>
+      <w:pPr>
+        <w:pStyle w:val="ListParagraph"/>
+        <w:numPr>
+          <w:ilvl w:val="1"/>
+          <w:numId w:val="1"/>
+        </w:numPr>
+      </w:pPr>
+      <w:r>
+        <w:rPr>
+          <w:b/>
+          <w:bCs/>
+        </w:rPr>
+        <w:t xml:space="preserve">Who</w:t>
+      </w:r>
+      <w:r>
+        <w:t xml:space="preserve">: part of the name of the person who made the change.</w:t>
+      </w:r>
+    </w:p>
+    <w:p>
+      <w:pPr>
+        <w:pStyle w:val="ListParagraph"/>
+        <w:numPr>
+          <w:ilvl w:val="1"/>
+          <w:numId w:val="1"/>
+        </w:numPr>
+      </w:pPr>
+      <w:r>
+        <w:rPr>
+          <w:b/>
+          <w:bCs/>
+        </w:rPr>
+        <w:t xml:space="preserve">What</w:t>
+      </w:r>
+      <w:r>
+        <w:t xml:space="preserve">: </w:t>
+      </w:r>
+      <w:r>
+        <w:rPr>
+          <w:b/>
+          <w:bCs/>
+        </w:rPr>
+        <w:t xml:space="preserve">Users</w:t>
+      </w:r>
+      <w:r>
+        <w:t xml:space="preserve">, </w:t>
+      </w:r>
+      <w:r>
+        <w:rPr>
+          <w:b/>
+          <w:bCs/>
+        </w:rPr>
+        <w:t xml:space="preserve">Calendar access</w:t>
+      </w:r>
+      <w:r>
+        <w:t xml:space="preserve">, </w:t>
+      </w:r>
+      <w:r>
+        <w:rPr>
+          <w:b/>
+          <w:bCs/>
+        </w:rPr>
+        <w:t xml:space="preserve">Organizations</w:t>
+      </w:r>
+      <w:r>
+        <w:t xml:space="preserve">, </w:t>
+      </w:r>
+      <w:r>
+        <w:rPr>
+          <w:b/>
+          <w:bCs/>
+        </w:rPr>
+        <w:t xml:space="preserve">Sectors, themes and tags</w:t>
+      </w:r>
+      <w:r>
+        <w:t xml:space="preserve"> or </w:t>
+      </w:r>
+      <w:r>
+        <w:rPr>
+          <w:b/>
+          <w:bCs/>
+        </w:rPr>
+        <w:t xml:space="preserve">Cabinet change</w:t>
+      </w:r>
+      <w:r>
+        <w:t xml:space="preserve">.</w:t>
+      </w:r>
+    </w:p>
+    <w:p>
+      <w:pPr>
+        <w:pStyle w:val="ListParagraph"/>
+        <w:numPr>
+          <w:ilvl w:val="1"/>
+          <w:numId w:val="1"/>
+        </w:numPr>
+      </w:pPr>
+      <w:r>
+        <w:rPr>
+          <w:b/>
+          <w:bCs/>
+        </w:rPr>
+        <w:t xml:space="preserve">From</w:t>
+      </w:r>
+      <w:r>
+        <w:t xml:space="preserve"> and </w:t>
+      </w:r>
+      <w:r>
+        <w:rPr>
+          <w:b/>
+          <w:bCs/>
+        </w:rPr>
+        <w:t xml:space="preserve">To</w:t>
+      </w:r>
+      <w:r>
+        <w:t xml:space="preserve">: BC dates. Both days are included.</w:t>
+      </w:r>
+    </w:p>
+    <w:p>
+      <w:pPr>
+        <w:pStyle w:val="ListParagraph"/>
+        <w:numPr>
+          <w:ilvl w:val="0"/>
+          <w:numId w:val="32"/>
+        </w:numPr>
+      </w:pPr>
+      <w:r>
+        <w:t xml:space="preserve">Choose </w:t>
+      </w:r>
+      <w:r>
+        <w:rPr>
+          <w:b/>
+          <w:bCs/>
+        </w:rPr>
+        <w:t xml:space="preserve">Show</w:t>
+      </w:r>
+      <w:r>
+        <w:t xml:space="preserve">. The count above the table says how many changes match.</w:t>
+      </w:r>
+    </w:p>
+    <w:p>
+      <w:pPr>
+        <w:pStyle w:val="ListParagraph"/>
+        <w:numPr>
+          <w:ilvl w:val="0"/>
+          <w:numId w:val="32"/>
+        </w:numPr>
+      </w:pPr>
+      <w:r>
+        <w:t xml:space="preserve">Choose </w:t>
+      </w:r>
+      <w:r>
+        <w:rPr>
+          <w:b/>
+          <w:bCs/>
+        </w:rPr>
+        <w:t xml:space="preserve">Next</w:t>
+      </w:r>
+      <w:r>
+        <w:t xml:space="preserve"> and </w:t>
+      </w:r>
+      <w:r>
+        <w:rPr>
+          <w:b/>
+          <w:bCs/>
+        </w:rPr>
+        <w:t xml:space="preserve">Previous</w:t>
+      </w:r>
+      <w:r>
+        <w:t xml:space="preserve"> to page through them. </w:t>
+      </w:r>
+      <w:r>
+        <w:rPr>
+          <w:b/>
+          <w:bCs/>
+        </w:rPr>
+        <w:t xml:space="preserve">Clear filters</w:t>
+      </w:r>
+      <w:r>
+        <w:t xml:space="preserve"> shows everything again.</w:t>
       </w:r>
     </w:p>
     <w:p>
@@ -7995,141 +8660,17 @@
         <w:spacing w:after="120"/>
       </w:pPr>
       <w:r>
-        <w:t xml:space="preserve">You can open every </w:t>
-      </w:r>
-      <w:r>
-        <w:rPr>
-          <w:b/>
-          <w:bCs/>
-        </w:rPr>
-        <w:t xml:space="preserve">Website</w:t>
-      </w:r>
-      <w:r>
-        <w:t xml:space="preserve"> tab: </w:t>
-      </w:r>
-      <w:r>
-        <w:rPr>
-          <w:b/>
-          <w:bCs/>
-        </w:rPr>
-        <w:t xml:space="preserve">Carousel</w:t>
-      </w:r>
-      <w:r>
-        <w:t xml:space="preserve">, </w:t>
-      </w:r>
-      <w:r>
-        <w:rPr>
-          <w:b/>
-          <w:bCs/>
-        </w:rPr>
-        <w:t xml:space="preserve">Emergency pins</w:t>
-      </w:r>
-      <w:r>
-        <w:t xml:space="preserve">, </w:t>
-      </w:r>
-      <w:r>
-        <w:rPr>
-          <w:b/>
-          <w:bCs/>
-        </w:rPr>
-        <w:t xml:space="preserve">Live Feed</w:t>
-      </w:r>
-      <w:r>
-        <w:t xml:space="preserve">, </w:t>
-      </w:r>
-      <w:r>
-        <w:rPr>
-          <w:b/>
-          <w:bCs/>
-        </w:rPr>
-        <w:t xml:space="preserve">What's featured where</w:t>
-      </w:r>
-      <w:r>
-        <w:t xml:space="preserve">, </w:t>
-      </w:r>
-      <w:r>
-        <w:rPr>
-          <w:b/>
-          <w:bCs/>
-        </w:rPr>
-        <w:t xml:space="preserve">Resource links</w:t>
-      </w:r>
-      <w:r>
-        <w:t xml:space="preserve">, </w:t>
-      </w:r>
-      <w:r>
-        <w:rPr>
-          <w:b/>
-          <w:bCs/>
-        </w:rPr>
-        <w:t xml:space="preserve">Files</w:t>
-      </w:r>
-      <w:r>
-        <w:t xml:space="preserve">, </w:t>
-      </w:r>
-      <w:r>
-        <w:rPr>
-          <w:b/>
-          <w:bCs/>
-        </w:rPr>
-        <w:t xml:space="preserve">Website log</w:t>
-      </w:r>
-      <w:r>
-        <w:t xml:space="preserve"> and </w:t>
-      </w:r>
-      <w:r>
-        <w:rPr>
-          <w:b/>
-          <w:bCs/>
-        </w:rPr>
-        <w:t xml:space="preserve">Site settings</w:t>
-      </w:r>
-      <w:r>
-        <w:t xml:space="preserve">. You see what is live, but there are no </w:t>
-      </w:r>
-      <w:r>
-        <w:rPr>
-          <w:b/>
-          <w:bCs/>
-        </w:rPr>
-        <w:t xml:space="preserve">Save</w:t>
-      </w:r>
-      <w:r>
-        <w:t xml:space="preserve"> or </w:t>
-      </w:r>
-      <w:r>
-        <w:rPr>
-          <w:b/>
-          <w:bCs/>
-        </w:rPr>
-        <w:t xml:space="preserve">Publish</w:t>
-      </w:r>
-      <w:r>
-        <w:t xml:space="preserve"> buttons.</w:t>
-      </w:r>
-    </w:p>
-    <w:p>
-      <w:pPr>
-        <w:spacing w:after="120"/>
-      </w:pPr>
-      <w:r>
-        <w:t xml:space="preserve">Site editors make those changes. The </w:t>
-      </w:r>
-      <w:r>
-        <w:t xml:space="preserve">Site editor manual</w:t>
-      </w:r>
-      <w:r>
-        <w:t xml:space="preserve"> explains what each tab does. If your work needs them, give your own account the </w:t>
-      </w:r>
-      <w:r>
-        <w:rPr>
-          <w:b/>
-          <w:bCs/>
-        </w:rPr>
-        <w:t xml:space="preserve">NRMS Site editor</w:t>
-      </w:r>
-      <w:r>
-        <w:t xml:space="preserve"> role on </w:t>
+        <w:t xml:space="preserve">To see one person's or one ministry's changes, choose </w:t>
+      </w:r>
+      <w:r>
+        <w:rPr>
+          <w:b/>
+          <w:bCs/>
+        </w:rPr>
+        <w:t xml:space="preserve">Edit</w:t>
+      </w:r>
+      <w:r>
+        <w:t xml:space="preserve"> on their row on </w:t>
       </w:r>
       <w:hyperlink w:history="1" w:anchor="section_2">
         <w:r>
@@ -8137,13 +8678,102 @@
         </w:r>
       </w:hyperlink>
       <w:r>
+        <w:t xml:space="preserve"> or </w:t>
+      </w:r>
+      <w:hyperlink w:history="1" w:anchor="section_4">
+        <w:r>
+          <w:t xml:space="preserve">Organizations</w:t>
+        </w:r>
+      </w:hyperlink>
+      <w:r>
+        <w:t xml:space="preserve">, then open </w:t>
+      </w:r>
+      <w:r>
+        <w:rPr>
+          <w:b/>
+          <w:bCs/>
+        </w:rPr>
+        <w:t xml:space="preserve">History</w:t>
+      </w:r>
+      <w:r>
         <w:t xml:space="preserve">.</w:t>
       </w:r>
     </w:p>
     <w:p>
       <w:pPr>
-        <w:spacing w:after="120"/>
-      </w:pPr>
+        <w:pStyle w:val="Heading2"/>
+      </w:pPr>
+      <w:r>
+        <w:t xml:space="preserve">What to know</w:t>
+      </w:r>
+    </w:p>
+    <w:p>
+      <w:pPr>
+        <w:pStyle w:val="ListParagraph"/>
+        <w:numPr>
+          <w:ilvl w:val="0"/>
+          <w:numId w:val="1"/>
+        </w:numPr>
+      </w:pPr>
+      <w:r>
+        <w:t xml:space="preserve">Changes are kept for good. Nothing on this screen can be edited or deleted.</w:t>
+      </w:r>
+    </w:p>
+    <w:p>
+      <w:pPr>
+        <w:pStyle w:val="ListParagraph"/>
+        <w:numPr>
+          <w:ilvl w:val="0"/>
+          <w:numId w:val="1"/>
+        </w:numPr>
+      </w:pPr>
+      <w:r>
+        <w:t xml:space="preserve">Only what changed is kept: a name or abbreviation before and after, the roles given or taken, which ministry details changed. Passwords never are: the history says only that a new password was set.</w:t>
+      </w:r>
+    </w:p>
+    <w:p>
+      <w:pPr>
+        <w:pStyle w:val="ListParagraph"/>
+        <w:numPr>
+          <w:ilvl w:val="0"/>
+          <w:numId w:val="1"/>
+        </w:numPr>
+      </w:pPr>
+      <w:r>
+        <w:t xml:space="preserve">Changes made before the Hub started keeping this history aren't listed.</w:t>
+      </w:r>
+    </w:p>
+    <w:p>
+      <w:pPr>
+        <w:pStyle w:val="ListParagraph"/>
+        <w:numPr>
+          <w:ilvl w:val="0"/>
+          <w:numId w:val="1"/>
+        </w:numPr>
+      </w:pPr>
+      <w:r>
+        <w:t xml:space="preserve">Changes on </w:t>
+      </w:r>
+      <w:r>
+        <w:rPr>
+          <w:b/>
+          <w:bCs/>
+        </w:rPr>
+        <w:t xml:space="preserve">Government terms</w:t>
+      </w:r>
+      <w:r>
+        <w:t xml:space="preserve"> aren't listed here. They are in </w:t>
+      </w:r>
+      <w:r>
+        <w:rPr>
+          <w:b/>
+          <w:bCs/>
+        </w:rPr>
+        <w:t xml:space="preserve">Website</w:t>
+      </w:r>
+      <w:r>
+        <w:t xml:space="preserve"> &gt; </w:t>
+      </w:r>
       <w:r>
         <w:rPr>
           <w:b/>
@@ -8152,207 +8782,27 @@
         <w:t xml:space="preserve">Website log</w:t>
       </w:r>
       <w:r>
-        <w:t xml:space="preserve"> lists every change to the public site's content: who, when and what. Use it to check who changed something.</w:t>
-      </w:r>
-    </w:p>
-    <w:p>
-      <w:pPr>
-        <w:pStyle w:val="Heading2"/>
-      </w:pPr>
-      <w:r>
-        <w:t xml:space="preserve">Turn Project Blue Bridge on or off</w:t>
-      </w:r>
-    </w:p>
-    <w:p>
-      <w:pPr>
-        <w:spacing w:after="120"/>
-      </w:pPr>
-      <w:r>
-        <w:t xml:space="preserve">Turn it on only with approval from the Intergovernmental Relations Secretariat (IGRS). The same steps turn it off.</w:t>
-      </w:r>
-    </w:p>
-    <w:p>
-      <w:pPr>
-        <w:pStyle w:val="ListParagraph"/>
-        <w:numPr>
-          <w:ilvl w:val="0"/>
-          <w:numId w:val="30"/>
-        </w:numPr>
-      </w:pPr>
-      <w:r>
-        <w:t xml:space="preserve">Open </w:t>
-      </w:r>
-      <w:r>
-        <w:rPr>
-          <w:b/>
-          <w:bCs/>
-        </w:rPr>
-        <w:t xml:space="preserve">Website</w:t>
-      </w:r>
-      <w:r>
-        <w:t xml:space="preserve"> &gt; </w:t>
-      </w:r>
-      <w:r>
-        <w:rPr>
-          <w:b/>
-          <w:bCs/>
-        </w:rPr>
-        <w:t xml:space="preserve">Site settings</w:t>
-      </w:r>
-      <w:r>
-        <w:t xml:space="preserve"> &gt; </w:t>
-      </w:r>
-      <w:r>
-        <w:rPr>
-          <w:b/>
-          <w:bCs/>
-        </w:rPr>
-        <w:t xml:space="preserve">Project Blue Bridge</w:t>
-      </w:r>
-      <w:r>
-        <w:t xml:space="preserve">. The page shows "Project Blue Bridge is currently OFF." (or ON).</w:t>
-      </w:r>
-    </w:p>
-    <w:p>
-      <w:pPr>
-        <w:pStyle w:val="ListParagraph"/>
-        <w:numPr>
-          <w:ilvl w:val="0"/>
-          <w:numId w:val="30"/>
-        </w:numPr>
-      </w:pPr>
-      <w:r>
-        <w:t xml:space="preserve">Choose the </w:t>
-      </w:r>
-      <w:r>
-        <w:rPr>
-          <w:b/>
-          <w:bCs/>
-        </w:rPr>
-        <w:t xml:space="preserve">Project Blue Bridge</w:t>
-      </w:r>
-      <w:r>
-        <w:t xml:space="preserve"> switch. A box asks "Turn Project Blue Bridge on?" and repeats the warning "Do not click OK unless you have approval from IGRS".</w:t>
-      </w:r>
-    </w:p>
-    <w:p>
-      <w:pPr>
-        <w:pStyle w:val="ListParagraph"/>
-        <w:numPr>
-          <w:ilvl w:val="0"/>
-          <w:numId w:val="30"/>
-        </w:numPr>
-      </w:pPr>
-      <w:r>
-        <w:t xml:space="preserve">Type KING CHARLES III in </w:t>
-      </w:r>
-      <w:r>
-        <w:rPr>
-          <w:b/>
-          <w:bCs/>
-        </w:rPr>
-        <w:t xml:space="preserve">Type KING CHARLES III to confirm</w:t>
-      </w:r>
-      <w:r>
-        <w:t xml:space="preserve">, in capitals, exactly.</w:t>
-      </w:r>
-    </w:p>
-    <w:p>
-      <w:pPr>
-        <w:pStyle w:val="ListParagraph"/>
-        <w:numPr>
-          <w:ilvl w:val="0"/>
-          <w:numId w:val="30"/>
-        </w:numPr>
-      </w:pPr>
-      <w:r>
-        <w:t xml:space="preserve">Tick </w:t>
-      </w:r>
-      <w:r>
-        <w:rPr>
-          <w:b/>
-          <w:bCs/>
-        </w:rPr>
-        <w:t xml:space="preserve">IGRS has approved this change</w:t>
-      </w:r>
-      <w:r>
-        <w:t xml:space="preserve">.</w:t>
-      </w:r>
-    </w:p>
-    <w:p>
-      <w:pPr>
-        <w:pStyle w:val="ListParagraph"/>
-        <w:numPr>
-          <w:ilvl w:val="0"/>
-          <w:numId w:val="30"/>
-        </w:numPr>
-      </w:pPr>
-      <w:r>
-        <w:t xml:space="preserve">Choose </w:t>
-      </w:r>
-      <w:r>
-        <w:rPr>
-          <w:b/>
-          <w:bCs/>
-        </w:rPr>
-        <w:t xml:space="preserve">Confirm turn on</w:t>
-      </w:r>
-      <w:r>
-        <w:t xml:space="preserve"> (or </w:t>
-      </w:r>
-      <w:r>
-        <w:rPr>
-          <w:b/>
-          <w:bCs/>
-        </w:rPr>
-        <w:t xml:space="preserve">Confirm turn off</w:t>
-      </w:r>
-      <w:r>
-        <w:t xml:space="preserve">). Until steps 3 and 4 are done, the button stays greyed out.</w:t>
-      </w:r>
-    </w:p>
-    <w:p>
-      <w:pPr>
-        <w:spacing w:after="120"/>
-      </w:pPr>
-      <w:r>
-        <w:t xml:space="preserve">The page then shows "Project Blue Bridge is currently ON." and, below the switch, "Turned on at 2:30 PM. Live now: the public site shows it within a few minutes." (with the time).</w:t>
-      </w:r>
-    </w:p>
-    <w:p>
-      <w:pPr>
-        <w:spacing w:after="120"/>
-      </w:pPr>
-      <w:r>
-        <w:t xml:space="preserve">The banner's wording is on </w:t>
-      </w:r>
-      <w:r>
-        <w:rPr>
-          <w:b/>
-          <w:bCs/>
-        </w:rPr>
-        <w:t xml:space="preserve">Site settings</w:t>
-      </w:r>
-      <w:r>
-        <w:t xml:space="preserve"> &gt; </w:t>
-      </w:r>
-      <w:r>
-        <w:rPr>
-          <w:b/>
-          <w:bCs/>
-        </w:rPr>
-        <w:t xml:space="preserve">Site identity</w:t>
-      </w:r>
-      <w:r>
-        <w:t xml:space="preserve">, which site editors change.</w:t>
-      </w:r>
-    </w:p>
-    <w:p>
-      <w:pPr>
-        <w:pStyle w:val="Heading2"/>
-      </w:pPr>
-      <w:r>
-        <w:t xml:space="preserve">What happens next</w:t>
+        <w:t xml:space="preserve">: choose </w:t>
+      </w:r>
+      <w:r>
+        <w:rPr>
+          <w:b/>
+          <w:bCs/>
+        </w:rPr>
+        <w:t xml:space="preserve">Government terms</w:t>
+      </w:r>
+      <w:r>
+        <w:t xml:space="preserve"> in </w:t>
+      </w:r>
+      <w:r>
+        <w:rPr>
+          <w:b/>
+          <w:bCs/>
+        </w:rPr>
+        <w:t xml:space="preserve">Filter by area</w:t>
+      </w:r>
+      <w:r>
+        <w:t xml:space="preserve">. Only Core administrators see those lines.</w:t>
       </w:r>
     </w:p>
     <w:p>
@@ -8364,53 +8814,7 @@
         </w:numPr>
       </w:pPr>
       <w:r>
-        <w:t xml:space="preserve">The public site changes to its mourning theme, with a black banner announcing the King's death. The home page changes within a few minutes; older pages follow over the following minutes, newest first.</w:t>
-      </w:r>
-    </w:p>
-    <w:p>
-      <w:pPr>
-        <w:pStyle w:val="ListParagraph"/>
-        <w:numPr>
-          <w:ilvl w:val="0"/>
-          <w:numId w:val="1"/>
-        </w:numPr>
-      </w:pPr>
-      <w:r>
-        <w:t xml:space="preserve">Every active Core administrator gets an email such as "Project Blue Bridge turned ON on {site}", saying who changed it and when.</w:t>
-      </w:r>
-    </w:p>
-    <w:p>
-      <w:pPr>
-        <w:pStyle w:val="ListParagraph"/>
-        <w:numPr>
-          <w:ilvl w:val="0"/>
-          <w:numId w:val="1"/>
-        </w:numPr>
-      </w:pPr>
-      <w:r>
-        <w:t xml:space="preserve">The change is listed in </w:t>
-      </w:r>
-      <w:r>
-        <w:rPr>
-          <w:b/>
-          <w:bCs/>
-        </w:rPr>
-        <w:t xml:space="preserve">Website log</w:t>
-      </w:r>
-      <w:r>
-        <w:t xml:space="preserve">.</w:t>
-      </w:r>
-    </w:p>
-    <w:p>
-      <w:pPr>
-        <w:pStyle w:val="ListParagraph"/>
-        <w:numPr>
-          <w:ilvl w:val="0"/>
-          <w:numId w:val="1"/>
-        </w:numPr>
-      </w:pPr>
-      <w:r>
-        <w:t xml:space="preserve">Turning it off puts the site back the same way.</w:t>
+        <w:t xml:space="preserve">Two entries aren't made on these screens. A person's first Microsoft sign-in, which links their account, is listed under their own name. Sending every ministry, user, sector, theme and tag to the other apps again is listed under whoever started it.</w:t>
       </w:r>
     </w:p>
     <w:p>
@@ -8474,6 +8878,617 @@
         <w:tc>
           <w:p>
             <w:r>
+              <w:t xml:space="preserve">"From must be on or before To."</w:t>
+            </w:r>
+          </w:p>
+        </w:tc>
+        <w:tc>
+          <w:p>
+            <w:r>
+              <w:t xml:space="preserve">The dates are the wrong way round. Swap them, then choose </w:t>
+            </w:r>
+            <w:r>
+              <w:rPr>
+                <w:b/>
+                <w:bCs/>
+              </w:rPr>
+              <w:t xml:space="preserve">Show</w:t>
+            </w:r>
+            <w:r>
+              <w:t xml:space="preserve">.</w:t>
+            </w:r>
+          </w:p>
+        </w:tc>
+      </w:tr>
+      <w:tr>
+        <w:tc>
+          <w:p>
+            <w:r>
+              <w:t xml:space="preserve">"No changes match these filters."</w:t>
+            </w:r>
+          </w:p>
+        </w:tc>
+        <w:tc>
+          <w:p>
+            <w:r>
+              <w:t xml:space="preserve">Nothing matches. Try part of a name, or a wider date range.</w:t>
+            </w:r>
+          </w:p>
+        </w:tc>
+      </w:tr>
+      <w:tr>
+        <w:tc>
+          <w:p>
+            <w:r>
+              <w:t xml:space="preserve">"Couldn't load the admin history."</w:t>
+            </w:r>
+          </w:p>
+        </w:tc>
+        <w:tc>
+          <w:p>
+            <w:r>
+              <w:t xml:space="preserve">Reload the page. If that keeps happening, tell the support team.</w:t>
+            </w:r>
+          </w:p>
+        </w:tc>
+      </w:tr>
+    </w:tbl>
+    <w:p/>
+    <w:p>
+      <w:pPr>
+        <w:pStyle w:val="Heading1"/>
+      </w:pPr>
+      <w:bookmarkStart w:name="section_12" w:id="12"/>
+      <w:r>
+        <w:t xml:space="preserve">Website and Project Blue Bridge</w:t>
+      </w:r>
+      <w:bookmarkEnd w:id="12"/>
+    </w:p>
+    <w:p>
+      <w:pPr>
+        <w:spacing w:after="120"/>
+      </w:pPr>
+      <w:r>
+        <w:rPr>
+          <w:b/>
+          <w:bCs/>
+        </w:rPr>
+        <w:t xml:space="preserve">Who this is for:</w:t>
+      </w:r>
+      <w:r>
+        <w:t xml:space="preserve"> Core administrators (Core.Admin).</w:t>
+      </w:r>
+    </w:p>
+    <w:p>
+      <w:pPr>
+        <w:spacing w:after="120"/>
+      </w:pPr>
+      <w:r>
+        <w:t xml:space="preserve">In </w:t>
+      </w:r>
+      <w:r>
+        <w:rPr>
+          <w:b/>
+          <w:bCs/>
+        </w:rPr>
+        <w:t xml:space="preserve">Website</w:t>
+      </w:r>
+      <w:r>
+        <w:t xml:space="preserve">, the one thing only you can change is </w:t>
+      </w:r>
+      <w:r>
+        <w:rPr>
+          <w:b/>
+          <w:bCs/>
+        </w:rPr>
+        <w:t xml:space="preserve">Project Blue Bridge</w:t>
+      </w:r>
+      <w:r>
+        <w:t xml:space="preserve">: the switch that puts the public site into mourning when the King dies. Everything else in </w:t>
+      </w:r>
+      <w:r>
+        <w:rPr>
+          <w:b/>
+          <w:bCs/>
+        </w:rPr>
+        <w:t xml:space="preserve">Website</w:t>
+      </w:r>
+      <w:r>
+        <w:t xml:space="preserve"> is view-only for you.</w:t>
+      </w:r>
+    </w:p>
+    <w:p>
+      <w:pPr>
+        <w:pStyle w:val="Heading2"/>
+      </w:pPr>
+      <w:r>
+        <w:t xml:space="preserve">What you can and can't change in Website</w:t>
+      </w:r>
+    </w:p>
+    <w:p>
+      <w:pPr>
+        <w:spacing w:after="120"/>
+      </w:pPr>
+      <w:r>
+        <w:t xml:space="preserve">You can open every </w:t>
+      </w:r>
+      <w:r>
+        <w:rPr>
+          <w:b/>
+          <w:bCs/>
+        </w:rPr>
+        <w:t xml:space="preserve">Website</w:t>
+      </w:r>
+      <w:r>
+        <w:t xml:space="preserve"> tab: </w:t>
+      </w:r>
+      <w:r>
+        <w:rPr>
+          <w:b/>
+          <w:bCs/>
+        </w:rPr>
+        <w:t xml:space="preserve">Carousel</w:t>
+      </w:r>
+      <w:r>
+        <w:t xml:space="preserve">, </w:t>
+      </w:r>
+      <w:r>
+        <w:rPr>
+          <w:b/>
+          <w:bCs/>
+        </w:rPr>
+        <w:t xml:space="preserve">Emergency pins</w:t>
+      </w:r>
+      <w:r>
+        <w:t xml:space="preserve">, </w:t>
+      </w:r>
+      <w:r>
+        <w:rPr>
+          <w:b/>
+          <w:bCs/>
+        </w:rPr>
+        <w:t xml:space="preserve">Live Feed</w:t>
+      </w:r>
+      <w:r>
+        <w:t xml:space="preserve">, </w:t>
+      </w:r>
+      <w:r>
+        <w:rPr>
+          <w:b/>
+          <w:bCs/>
+        </w:rPr>
+        <w:t xml:space="preserve">What's featured where</w:t>
+      </w:r>
+      <w:r>
+        <w:t xml:space="preserve">, </w:t>
+      </w:r>
+      <w:r>
+        <w:rPr>
+          <w:b/>
+          <w:bCs/>
+        </w:rPr>
+        <w:t xml:space="preserve">Resource links</w:t>
+      </w:r>
+      <w:r>
+        <w:t xml:space="preserve">, </w:t>
+      </w:r>
+      <w:r>
+        <w:rPr>
+          <w:b/>
+          <w:bCs/>
+        </w:rPr>
+        <w:t xml:space="preserve">Files</w:t>
+      </w:r>
+      <w:r>
+        <w:t xml:space="preserve">, </w:t>
+      </w:r>
+      <w:r>
+        <w:rPr>
+          <w:b/>
+          <w:bCs/>
+        </w:rPr>
+        <w:t xml:space="preserve">Website log</w:t>
+      </w:r>
+      <w:r>
+        <w:t xml:space="preserve"> and </w:t>
+      </w:r>
+      <w:r>
+        <w:rPr>
+          <w:b/>
+          <w:bCs/>
+        </w:rPr>
+        <w:t xml:space="preserve">Site settings</w:t>
+      </w:r>
+      <w:r>
+        <w:t xml:space="preserve">. You see what is live, but there are no </w:t>
+      </w:r>
+      <w:r>
+        <w:rPr>
+          <w:b/>
+          <w:bCs/>
+        </w:rPr>
+        <w:t xml:space="preserve">Save</w:t>
+      </w:r>
+      <w:r>
+        <w:t xml:space="preserve"> or </w:t>
+      </w:r>
+      <w:r>
+        <w:rPr>
+          <w:b/>
+          <w:bCs/>
+        </w:rPr>
+        <w:t xml:space="preserve">Publish</w:t>
+      </w:r>
+      <w:r>
+        <w:t xml:space="preserve"> buttons.</w:t>
+      </w:r>
+    </w:p>
+    <w:p>
+      <w:pPr>
+        <w:spacing w:after="120"/>
+      </w:pPr>
+      <w:r>
+        <w:t xml:space="preserve">Site editors make those changes. The </w:t>
+      </w:r>
+      <w:r>
+        <w:t xml:space="preserve">Site editor manual</w:t>
+      </w:r>
+      <w:r>
+        <w:t xml:space="preserve"> explains what each tab does. If your work needs them, give your own account the </w:t>
+      </w:r>
+      <w:r>
+        <w:rPr>
+          <w:b/>
+          <w:bCs/>
+        </w:rPr>
+        <w:t xml:space="preserve">NRMS Site editor</w:t>
+      </w:r>
+      <w:r>
+        <w:t xml:space="preserve"> role on </w:t>
+      </w:r>
+      <w:hyperlink w:history="1" w:anchor="section_2">
+        <w:r>
+          <w:t xml:space="preserve">Users</w:t>
+        </w:r>
+      </w:hyperlink>
+      <w:r>
+        <w:t xml:space="preserve">.</w:t>
+      </w:r>
+    </w:p>
+    <w:p>
+      <w:pPr>
+        <w:spacing w:after="120"/>
+      </w:pPr>
+      <w:r>
+        <w:rPr>
+          <w:b/>
+          <w:bCs/>
+        </w:rPr>
+        <w:t xml:space="preserve">Website log</w:t>
+      </w:r>
+      <w:r>
+        <w:t xml:space="preserve"> lists every change to the public site's content: who, when and what. Use it to check who changed something.</w:t>
+      </w:r>
+    </w:p>
+    <w:p>
+      <w:pPr>
+        <w:pStyle w:val="Heading2"/>
+      </w:pPr>
+      <w:r>
+        <w:t xml:space="preserve">Turn Project Blue Bridge on or off</w:t>
+      </w:r>
+    </w:p>
+    <w:p>
+      <w:pPr>
+        <w:spacing w:after="120"/>
+      </w:pPr>
+      <w:r>
+        <w:t xml:space="preserve">Turn it on only with approval from the Intergovernmental Relations Secretariat (IGRS). The same steps turn it off.</w:t>
+      </w:r>
+    </w:p>
+    <w:p>
+      <w:pPr>
+        <w:pStyle w:val="ListParagraph"/>
+        <w:numPr>
+          <w:ilvl w:val="0"/>
+          <w:numId w:val="33"/>
+        </w:numPr>
+      </w:pPr>
+      <w:r>
+        <w:t xml:space="preserve">Open </w:t>
+      </w:r>
+      <w:r>
+        <w:rPr>
+          <w:b/>
+          <w:bCs/>
+        </w:rPr>
+        <w:t xml:space="preserve">Website</w:t>
+      </w:r>
+      <w:r>
+        <w:t xml:space="preserve"> &gt; </w:t>
+      </w:r>
+      <w:r>
+        <w:rPr>
+          <w:b/>
+          <w:bCs/>
+        </w:rPr>
+        <w:t xml:space="preserve">Site settings</w:t>
+      </w:r>
+      <w:r>
+        <w:t xml:space="preserve"> &gt; </w:t>
+      </w:r>
+      <w:r>
+        <w:rPr>
+          <w:b/>
+          <w:bCs/>
+        </w:rPr>
+        <w:t xml:space="preserve">Project Blue Bridge</w:t>
+      </w:r>
+      <w:r>
+        <w:t xml:space="preserve">. The page shows "Project Blue Bridge is currently OFF." (or ON).</w:t>
+      </w:r>
+    </w:p>
+    <w:p>
+      <w:pPr>
+        <w:pStyle w:val="ListParagraph"/>
+        <w:numPr>
+          <w:ilvl w:val="0"/>
+          <w:numId w:val="33"/>
+        </w:numPr>
+      </w:pPr>
+      <w:r>
+        <w:t xml:space="preserve">Choose the </w:t>
+      </w:r>
+      <w:r>
+        <w:rPr>
+          <w:b/>
+          <w:bCs/>
+        </w:rPr>
+        <w:t xml:space="preserve">Project Blue Bridge</w:t>
+      </w:r>
+      <w:r>
+        <w:t xml:space="preserve"> switch. A box asks "Turn Project Blue Bridge on?" and repeats the warning "Do not click OK unless you have approval from IGRS".</w:t>
+      </w:r>
+    </w:p>
+    <w:p>
+      <w:pPr>
+        <w:pStyle w:val="ListParagraph"/>
+        <w:numPr>
+          <w:ilvl w:val="0"/>
+          <w:numId w:val="33"/>
+        </w:numPr>
+      </w:pPr>
+      <w:r>
+        <w:t xml:space="preserve">Type KING CHARLES III in </w:t>
+      </w:r>
+      <w:r>
+        <w:rPr>
+          <w:b/>
+          <w:bCs/>
+        </w:rPr>
+        <w:t xml:space="preserve">Type KING CHARLES III to confirm</w:t>
+      </w:r>
+      <w:r>
+        <w:t xml:space="preserve">, in capitals, exactly.</w:t>
+      </w:r>
+    </w:p>
+    <w:p>
+      <w:pPr>
+        <w:pStyle w:val="ListParagraph"/>
+        <w:numPr>
+          <w:ilvl w:val="0"/>
+          <w:numId w:val="33"/>
+        </w:numPr>
+      </w:pPr>
+      <w:r>
+        <w:t xml:space="preserve">Tick </w:t>
+      </w:r>
+      <w:r>
+        <w:rPr>
+          <w:b/>
+          <w:bCs/>
+        </w:rPr>
+        <w:t xml:space="preserve">IGRS has approved this change</w:t>
+      </w:r>
+      <w:r>
+        <w:t xml:space="preserve">.</w:t>
+      </w:r>
+    </w:p>
+    <w:p>
+      <w:pPr>
+        <w:pStyle w:val="ListParagraph"/>
+        <w:numPr>
+          <w:ilvl w:val="0"/>
+          <w:numId w:val="33"/>
+        </w:numPr>
+      </w:pPr>
+      <w:r>
+        <w:t xml:space="preserve">Choose </w:t>
+      </w:r>
+      <w:r>
+        <w:rPr>
+          <w:b/>
+          <w:bCs/>
+        </w:rPr>
+        <w:t xml:space="preserve">Confirm turn on</w:t>
+      </w:r>
+      <w:r>
+        <w:t xml:space="preserve"> (or </w:t>
+      </w:r>
+      <w:r>
+        <w:rPr>
+          <w:b/>
+          <w:bCs/>
+        </w:rPr>
+        <w:t xml:space="preserve">Confirm turn off</w:t>
+      </w:r>
+      <w:r>
+        <w:t xml:space="preserve">). Until steps 3 and 4 are done, the button stays greyed out.</w:t>
+      </w:r>
+    </w:p>
+    <w:p>
+      <w:pPr>
+        <w:spacing w:after="120"/>
+      </w:pPr>
+      <w:r>
+        <w:t xml:space="preserve">The page then shows "Project Blue Bridge is currently ON." and, below the switch, "Turned on at 2:30 PM. Live now: the public site shows it within a few minutes." (with the time).</w:t>
+      </w:r>
+    </w:p>
+    <w:p>
+      <w:pPr>
+        <w:spacing w:after="120"/>
+      </w:pPr>
+      <w:r>
+        <w:t xml:space="preserve">The banner's wording is on </w:t>
+      </w:r>
+      <w:r>
+        <w:rPr>
+          <w:b/>
+          <w:bCs/>
+        </w:rPr>
+        <w:t xml:space="preserve">Site settings</w:t>
+      </w:r>
+      <w:r>
+        <w:t xml:space="preserve"> &gt; </w:t>
+      </w:r>
+      <w:r>
+        <w:rPr>
+          <w:b/>
+          <w:bCs/>
+        </w:rPr>
+        <w:t xml:space="preserve">Site identity</w:t>
+      </w:r>
+      <w:r>
+        <w:t xml:space="preserve">, which site editors change.</w:t>
+      </w:r>
+    </w:p>
+    <w:p>
+      <w:pPr>
+        <w:pStyle w:val="Heading2"/>
+      </w:pPr>
+      <w:r>
+        <w:t xml:space="preserve">What happens next</w:t>
+      </w:r>
+    </w:p>
+    <w:p>
+      <w:pPr>
+        <w:pStyle w:val="ListParagraph"/>
+        <w:numPr>
+          <w:ilvl w:val="0"/>
+          <w:numId w:val="1"/>
+        </w:numPr>
+      </w:pPr>
+      <w:r>
+        <w:t xml:space="preserve">The public site changes to its mourning theme, with a black banner announcing the King's death. The home page changes within a few minutes; older pages follow over the following minutes, newest first.</w:t>
+      </w:r>
+    </w:p>
+    <w:p>
+      <w:pPr>
+        <w:pStyle w:val="ListParagraph"/>
+        <w:numPr>
+          <w:ilvl w:val="0"/>
+          <w:numId w:val="1"/>
+        </w:numPr>
+      </w:pPr>
+      <w:r>
+        <w:t xml:space="preserve">Every active Core administrator gets an email such as "Project Blue Bridge turned ON on {site}", saying who changed it and when.</w:t>
+      </w:r>
+    </w:p>
+    <w:p>
+      <w:pPr>
+        <w:pStyle w:val="ListParagraph"/>
+        <w:numPr>
+          <w:ilvl w:val="0"/>
+          <w:numId w:val="1"/>
+        </w:numPr>
+      </w:pPr>
+      <w:r>
+        <w:t xml:space="preserve">The change is listed in </w:t>
+      </w:r>
+      <w:r>
+        <w:rPr>
+          <w:b/>
+          <w:bCs/>
+        </w:rPr>
+        <w:t xml:space="preserve">Website log</w:t>
+      </w:r>
+      <w:r>
+        <w:t xml:space="preserve">.</w:t>
+      </w:r>
+    </w:p>
+    <w:p>
+      <w:pPr>
+        <w:pStyle w:val="ListParagraph"/>
+        <w:numPr>
+          <w:ilvl w:val="0"/>
+          <w:numId w:val="1"/>
+        </w:numPr>
+      </w:pPr>
+      <w:r>
+        <w:t xml:space="preserve">Turning it off puts the site back the same way.</w:t>
+      </w:r>
+    </w:p>
+    <w:p>
+      <w:pPr>
+        <w:pStyle w:val="Heading2"/>
+      </w:pPr>
+      <w:r>
+        <w:t xml:space="preserve">Can't do this?</w:t>
+      </w:r>
+    </w:p>
+    <w:tbl>
+      <w:tblPr>
+        <w:tblW w:type="pct" w:w="5000"/>
+        <w:tblBorders>
+          <w:top w:val="single" w:color="auto" w:sz="4"/>
+          <w:left w:val="single" w:color="auto" w:sz="4"/>
+          <w:bottom w:val="single" w:color="auto" w:sz="4"/>
+          <w:right w:val="single" w:color="auto" w:sz="4"/>
+          <w:insideH w:val="single" w:color="auto" w:sz="4"/>
+          <w:insideV w:val="single" w:color="auto" w:sz="4"/>
+        </w:tblBorders>
+      </w:tblPr>
+      <w:tblGrid>
+        <w:gridCol w:w="4513"/>
+        <w:gridCol w:w="4513"/>
+      </w:tblGrid>
+      <w:tr>
+        <w:trPr>
+          <w:tblHeader/>
+        </w:trPr>
+        <w:tc>
+          <w:tcPr>
+            <w:shd w:fill="E8EEF5" w:val="clear"/>
+          </w:tcPr>
+          <w:p>
+            <w:r>
+              <w:rPr>
+                <w:b/>
+                <w:bCs/>
+              </w:rPr>
+              <w:t xml:space="preserve">Message</w:t>
+            </w:r>
+          </w:p>
+        </w:tc>
+        <w:tc>
+          <w:tcPr>
+            <w:shd w:fill="E8EEF5" w:val="clear"/>
+          </w:tcPr>
+          <w:p>
+            <w:r>
+              <w:rPr>
+                <w:b/>
+                <w:bCs/>
+              </w:rPr>
+              <w:t xml:space="preserve">What it means</w:t>
+            </w:r>
+          </w:p>
+        </w:tc>
+      </w:tr>
+      <w:tr>
+        <w:tc>
+          <w:p>
+            <w:r>
               <w:t xml:space="preserve">"Someone else changed this — reload to see their changes."</w:t>
             </w:r>
           </w:p>
@@ -8511,11 +9526,11 @@
       <w:pPr>
         <w:pStyle w:val="Heading2"/>
       </w:pPr>
-      <w:bookmarkStart w:name="section_12" w:id="12"/>
+      <w:bookmarkStart w:name="section_13" w:id="13"/>
       <w:r>
         <w:t xml:space="preserve">When a new government takes office</w:t>
       </w:r>
-      <w:bookmarkEnd w:id="12"/>
+      <w:bookmarkEnd w:id="13"/>
     </w:p>
     <w:p>
       <w:pPr>
@@ -8801,7 +9816,7 @@
         <w:pStyle w:val="ListParagraph"/>
         <w:numPr>
           <w:ilvl w:val="0"/>
-          <w:numId w:val="31"/>
+          <w:numId w:val="34"/>
         </w:numPr>
       </w:pPr>
       <w:r>
@@ -8833,7 +9848,7 @@
         <w:pStyle w:val="ListParagraph"/>
         <w:numPr>
           <w:ilvl w:val="0"/>
-          <w:numId w:val="31"/>
+          <w:numId w:val="34"/>
         </w:numPr>
       </w:pPr>
       <w:r>
@@ -8865,7 +9880,7 @@
         <w:pStyle w:val="ListParagraph"/>
         <w:numPr>
           <w:ilvl w:val="0"/>
-          <w:numId w:val="31"/>
+          <w:numId w:val="34"/>
         </w:numPr>
       </w:pPr>
       <w:r>
@@ -8921,7 +9936,7 @@
         <w:pStyle w:val="ListParagraph"/>
         <w:numPr>
           <w:ilvl w:val="0"/>
-          <w:numId w:val="32"/>
+          <w:numId w:val="35"/>
         </w:numPr>
       </w:pPr>
       <w:r>
@@ -8953,7 +9968,7 @@
         <w:pStyle w:val="ListParagraph"/>
         <w:numPr>
           <w:ilvl w:val="0"/>
-          <w:numId w:val="32"/>
+          <w:numId w:val="35"/>
         </w:numPr>
       </w:pPr>
       <w:r>
@@ -8995,7 +10010,7 @@
         <w:pStyle w:val="ListParagraph"/>
         <w:numPr>
           <w:ilvl w:val="0"/>
-          <w:numId w:val="32"/>
+          <w:numId w:val="35"/>
         </w:numPr>
       </w:pPr>
       <w:r>
@@ -9017,7 +10032,7 @@
         <w:pStyle w:val="ListParagraph"/>
         <w:numPr>
           <w:ilvl w:val="0"/>
-          <w:numId w:val="32"/>
+          <w:numId w:val="35"/>
         </w:numPr>
       </w:pPr>
       <w:r>
@@ -9137,7 +10152,7 @@
         <w:pStyle w:val="ListParagraph"/>
         <w:numPr>
           <w:ilvl w:val="0"/>
-          <w:numId w:val="33"/>
+          <w:numId w:val="36"/>
         </w:numPr>
       </w:pPr>
       <w:r>
@@ -9235,7 +10250,7 @@
         <w:pStyle w:val="ListParagraph"/>
         <w:numPr>
           <w:ilvl w:val="0"/>
-          <w:numId w:val="33"/>
+          <w:numId w:val="36"/>
         </w:numPr>
       </w:pPr>
       <w:r>
@@ -9283,7 +10298,7 @@
         <w:pStyle w:val="ListParagraph"/>
         <w:numPr>
           <w:ilvl w:val="0"/>
-          <w:numId w:val="33"/>
+          <w:numId w:val="36"/>
         </w:numPr>
       </w:pPr>
       <w:r>
@@ -9294,11 +10309,11 @@
       <w:pPr>
         <w:pStyle w:val="Heading2"/>
       </w:pPr>
-      <w:bookmarkStart w:name="section_13" w:id="13"/>
+      <w:bookmarkStart w:name="section_14" w:id="14"/>
       <w:r>
         <w:t xml:space="preserve">Staying signed in, and unsaved changes</w:t>
       </w:r>
-      <w:bookmarkEnd w:id="13"/>
+      <w:bookmarkEnd w:id="14"/>
     </w:p>
     <w:p>
       <w:pPr>
@@ -10343,6 +11358,51 @@
     </w:lvlOverride>
   </w:num>
   <w:num w:numId="33">
+    <w:abstractNumId w:val="3"/>
+    <w:lvlOverride w:ilvl="0">
+      <w:startOverride w:val="1"/>
+    </w:lvlOverride>
+    <w:lvlOverride w:ilvl="1">
+      <w:startOverride w:val="1"/>
+    </w:lvlOverride>
+    <w:lvlOverride w:ilvl="2">
+      <w:startOverride w:val="1"/>
+    </w:lvlOverride>
+    <w:lvlOverride w:ilvl="3">
+      <w:startOverride w:val="1"/>
+    </w:lvlOverride>
+  </w:num>
+  <w:num w:numId="34">
+    <w:abstractNumId w:val="3"/>
+    <w:lvlOverride w:ilvl="0">
+      <w:startOverride w:val="1"/>
+    </w:lvlOverride>
+    <w:lvlOverride w:ilvl="1">
+      <w:startOverride w:val="1"/>
+    </w:lvlOverride>
+    <w:lvlOverride w:ilvl="2">
+      <w:startOverride w:val="1"/>
+    </w:lvlOverride>
+    <w:lvlOverride w:ilvl="3">
+      <w:startOverride w:val="1"/>
+    </w:lvlOverride>
+  </w:num>
+  <w:num w:numId="35">
+    <w:abstractNumId w:val="3"/>
+    <w:lvlOverride w:ilvl="0">
+      <w:startOverride w:val="1"/>
+    </w:lvlOverride>
+    <w:lvlOverride w:ilvl="1">
+      <w:startOverride w:val="1"/>
+    </w:lvlOverride>
+    <w:lvlOverride w:ilvl="2">
+      <w:startOverride w:val="1"/>
+    </w:lvlOverride>
+    <w:lvlOverride w:ilvl="3">
+      <w:startOverride w:val="1"/>
+    </w:lvlOverride>
+  </w:num>
+  <w:num w:numId="36">
     <w:abstractNumId w:val="3"/>
     <w:lvlOverride w:ilvl="0">
       <w:startOverride w:val="1"/>

</xml_diff>

<commit_message>
b0e0ec7690c7a24f5421cc90ebfed87aeb669322 deploy: siteground artifact
</commit_message>
<xml_diff>
--- a/hub/manuals/core-admin.docx
+++ b/hub/manuals/core-admin.docx
@@ -3285,7 +3285,7 @@
         <w:t xml:space="preserve">Copy public address</w:t>
       </w:r>
       <w:r>
-        <w:t xml:space="preserve"> beside it, then paste the address. A preview appears once the address starts with https://. An address copied from the Hub itself shows "This address points at the Hub, which the public can't open. On Website → Files, use Copy public address and paste that instead." Visitors couldn't see that photo.</w:t>
+        <w:t xml:space="preserve"> beside it, then paste the address. A preview appears once the address starts with https://. An address copied from the Hub itself shows "This address points at the Hub, which the public can't open. On Website → Files, use Copy public address and paste that instead." Visitors couldn't see that photo. It shows for the Hub's other known web addresses too, not just the one you are using.</w:t>
       </w:r>
     </w:p>
     <w:p>
@@ -9078,6 +9078,16 @@
           <w:bCs/>
         </w:rPr>
         <w:t xml:space="preserve">Files</w:t>
+      </w:r>
+      <w:r>
+        <w:t xml:space="preserve">, </w:t>
+      </w:r>
+      <w:r>
+        <w:rPr>
+          <w:b/>
+          <w:bCs/>
+        </w:rPr>
+        <w:t xml:space="preserve">Hub address check</w:t>
       </w:r>
       <w:r>
         <w:t xml:space="preserve">, </w:t>

</xml_diff>